<commit_message>
Fixed last bits of documentation
</commit_message>
<xml_diff>
--- a/Documentation/Milestone Documentation/Milestone 4/Milestone 4 Final Report Submit.docx
+++ b/Documentation/Milestone Documentation/Milestone 4/Milestone 4 Final Report Submit.docx
@@ -12,6 +12,7 @@
       <w:r>
         <w:rPr>
           <w:rFonts w:ascii="Times New Roman" w:hAnsi="Times New Roman" w:cs="Times New Roman"/>
+          <w:noProof/>
         </w:rPr>
         <w:drawing>
           <wp:anchor distT="0" distB="0" distL="114300" distR="114300" simplePos="0" relativeHeight="251655680" behindDoc="1" locked="0" layoutInCell="1" allowOverlap="1" wp14:anchorId="569DB349" wp14:editId="6344998C">
@@ -90,6 +91,7 @@
       <w:r>
         <w:rPr>
           <w:rFonts w:ascii="Times New Roman" w:hAnsi="Times New Roman" w:cs="Times New Roman"/>
+          <w:noProof/>
         </w:rPr>
         <mc:AlternateContent>
           <mc:Choice Requires="wps">
@@ -218,6 +220,7 @@
       <w:r>
         <w:rPr>
           <w:rFonts w:ascii="Times New Roman" w:hAnsi="Times New Roman" w:cs="Times New Roman"/>
+          <w:noProof/>
         </w:rPr>
         <mc:AlternateContent>
           <mc:Choice Requires="wps">
@@ -743,8 +746,13 @@
     <w:sdt>
       <w:sdtPr>
         <w:rPr>
-          <w:rFonts w:ascii="Times New Roman" w:hAnsi="Times New Roman" w:cs="Times New Roman"/>
-          <w:lang w:val="en-ZA"/>
+          <w:rFonts w:ascii="Times New Roman" w:eastAsiaTheme="minorEastAsia" w:hAnsi="Times New Roman" w:cs="Times New Roman"/>
+          <w:color w:val="auto"/>
+          <w:kern w:val="2"/>
+          <w:sz w:val="24"/>
+          <w:szCs w:val="24"/>
+          <w:lang w:val="en-ZA" w:eastAsia="ja-JP"/>
+          <w14:ligatures w14:val="standardContextual"/>
         </w:rPr>
         <w:id w:val="1478645195"/>
         <w:docPartObj>
@@ -754,15 +762,8 @@
       </w:sdtPr>
       <w:sdtEndPr>
         <w:rPr>
-          <w:rFonts w:eastAsiaTheme="minorEastAsia"/>
           <w:b/>
           <w:bCs/>
-          <w:color w:val="auto"/>
-          <w:kern w:val="2"/>
-          <w:sz w:val="24"/>
-          <w:szCs w:val="24"/>
-          <w:lang w:eastAsia="ja-JP"/>
-          <w14:ligatures w14:val="standardContextual"/>
         </w:rPr>
       </w:sdtEndPr>
       <w:sdtContent>
@@ -3356,7 +3357,16 @@
           <w:sz w:val="22"/>
           <w:szCs w:val="22"/>
         </w:rPr>
-        <w:t>8 pages of information</w:t>
+        <w:t>7</w:t>
+      </w:r>
+      <w:r>
+        <w:rPr>
+          <w:rFonts w:ascii="Times New Roman" w:eastAsia="Calibri" w:hAnsi="Times New Roman" w:cs="Times New Roman"/>
+          <w:color w:val="000000" w:themeColor="text1"/>
+          <w:sz w:val="22"/>
+          <w:szCs w:val="22"/>
+        </w:rPr>
+        <w:t xml:space="preserve"> pages of information</w:t>
       </w:r>
       <w:r>
         <w:rPr>
@@ -3605,36 +3615,7 @@
           <w:sz w:val="22"/>
           <w:szCs w:val="22"/>
         </w:rPr>
-        <w:t xml:space="preserve">not everyone has a fair and equal chance at getting a job </w:t>
-      </w:r>
-      <w:r>
-        <w:rPr>
-          <w:rFonts w:ascii="Times New Roman" w:eastAsia="Calibri" w:hAnsi="Times New Roman" w:cs="Times New Roman"/>
-          <w:color w:val="000000" w:themeColor="text1"/>
-          <w:sz w:val="22"/>
-          <w:szCs w:val="22"/>
-        </w:rPr>
-        <w:t>(</w:t>
-      </w:r>
-      <w:proofErr w:type="spellStart"/>
-      <w:r>
-        <w:rPr>
-          <w:rFonts w:ascii="Times New Roman" w:eastAsia="Calibri" w:hAnsi="Times New Roman" w:cs="Times New Roman"/>
-          <w:color w:val="000000" w:themeColor="text1"/>
-          <w:sz w:val="22"/>
-          <w:szCs w:val="22"/>
-        </w:rPr>
-        <w:t>Oyedemi</w:t>
-      </w:r>
-      <w:proofErr w:type="spellEnd"/>
-      <w:r>
-        <w:rPr>
-          <w:rFonts w:ascii="Times New Roman" w:eastAsia="Calibri" w:hAnsi="Times New Roman" w:cs="Times New Roman"/>
-          <w:color w:val="000000" w:themeColor="text1"/>
-          <w:sz w:val="22"/>
-          <w:szCs w:val="22"/>
-        </w:rPr>
-        <w:t xml:space="preserve"> and Choung, 2020)</w:t>
+        <w:t>not everyone has a fair and equal chance at getting a job (Oyedemi and Choung, 2020)</w:t>
       </w:r>
       <w:r>
         <w:rPr>
@@ -3661,34 +3642,7 @@
           <w:sz w:val="22"/>
           <w:szCs w:val="22"/>
         </w:rPr>
-        <w:t>. Government programmes such as South Africa Connect aim to close the gap, but access is still uneven</w:t>
-      </w:r>
-      <w:r>
-        <w:rPr>
-          <w:rFonts w:ascii="Times New Roman" w:eastAsia="Calibri" w:hAnsi="Times New Roman" w:cs="Times New Roman"/>
-          <w:color w:val="000000" w:themeColor="text1"/>
-          <w:sz w:val="22"/>
-          <w:szCs w:val="22"/>
-        </w:rPr>
-        <w:t xml:space="preserve"> </w:t>
-      </w:r>
-      <w:r>
-        <w:rPr>
-          <w:rFonts w:ascii="Times New Roman" w:eastAsia="Calibri" w:hAnsi="Times New Roman" w:cs="Times New Roman"/>
-          <w:color w:val="000000" w:themeColor="text1"/>
-          <w:sz w:val="22"/>
-          <w:szCs w:val="22"/>
-        </w:rPr>
-        <w:t>(Department of Communications, 2013)</w:t>
-      </w:r>
-      <w:r>
-        <w:rPr>
-          <w:rFonts w:ascii="Times New Roman" w:eastAsia="Calibri" w:hAnsi="Times New Roman" w:cs="Times New Roman"/>
-          <w:color w:val="000000" w:themeColor="text1"/>
-          <w:sz w:val="22"/>
-          <w:szCs w:val="22"/>
-        </w:rPr>
-        <w:t>. Education strongly affects employment and the open question is whether internet access changes how much education pays off. If it does, money spent on education may be under-delivering in places where people cannot get online.</w:t>
+        <w:t>. Government programmes such as South Africa Connect aim to close the gap, but access is still uneven. Education strongly affects employment and the open question is whether internet access changes how much education pays off. If it does, money spent on education may be under-delivering in places where people cannot get online.</w:t>
       </w:r>
     </w:p>
     <w:p>
@@ -3826,27 +3780,7 @@
           <w:szCs w:val="22"/>
         </w:rPr>
         <w:lastRenderedPageBreak/>
-        <w:t>occur, depending on the country and the group studied (</w:t>
-      </w:r>
-      <w:proofErr w:type="spellStart"/>
-      <w:r>
-        <w:rPr>
-          <w:rFonts w:ascii="Times New Roman" w:eastAsia="Calibri" w:hAnsi="Times New Roman" w:cs="Times New Roman"/>
-          <w:color w:val="000000" w:themeColor="text1"/>
-          <w:sz w:val="22"/>
-          <w:szCs w:val="22"/>
-        </w:rPr>
-        <w:t>Plavgo</w:t>
-      </w:r>
-      <w:proofErr w:type="spellEnd"/>
-      <w:r>
-        <w:rPr>
-          <w:rFonts w:ascii="Times New Roman" w:eastAsia="Calibri" w:hAnsi="Times New Roman" w:cs="Times New Roman"/>
-          <w:color w:val="000000" w:themeColor="text1"/>
-          <w:sz w:val="22"/>
-          <w:szCs w:val="22"/>
-        </w:rPr>
-        <w:t xml:space="preserve">, 2023). We therefore tested which one applies to South Africa’s working-age population instead of assuming it. </w:t>
+        <w:t xml:space="preserve">occur, depending on the country and the group studied (Plavgo, 2023). We therefore tested which one applies to South Africa’s working-age population instead of assuming it. </w:t>
       </w:r>
     </w:p>
     <w:tbl>
@@ -5160,17 +5094,47 @@
                 <w:szCs w:val="20"/>
                 <w:lang w:val="en-ZA"/>
               </w:rPr>
-              <w:t xml:space="preserve">50+ unique </w:t>
-            </w:r>
-            <w:r>
-              <w:rPr>
-                <w:rFonts w:ascii="Times New Roman" w:hAnsi="Times New Roman" w:cs="Times New Roman"/>
-                <w:color w:val="000000" w:themeColor="text1"/>
-                <w:sz w:val="20"/>
-                <w:szCs w:val="20"/>
-                <w:lang w:val="en-ZA"/>
-              </w:rPr>
-              <w:t>households instead of 1000+)</w:t>
+              <w:t>20684</w:t>
+            </w:r>
+            <w:r>
+              <w:rPr>
+                <w:rFonts w:ascii="Times New Roman" w:hAnsi="Times New Roman" w:cs="Times New Roman"/>
+                <w:color w:val="000000" w:themeColor="text1"/>
+                <w:sz w:val="20"/>
+                <w:szCs w:val="20"/>
+                <w:lang w:val="en-ZA"/>
+              </w:rPr>
+              <w:t xml:space="preserve"> unique </w:t>
+            </w:r>
+            <w:r>
+              <w:rPr>
+                <w:rFonts w:ascii="Times New Roman" w:hAnsi="Times New Roman" w:cs="Times New Roman"/>
+                <w:color w:val="000000" w:themeColor="text1"/>
+                <w:sz w:val="20"/>
+                <w:szCs w:val="20"/>
+                <w:lang w:val="en-ZA"/>
+              </w:rPr>
+              <w:t xml:space="preserve">households instead of </w:t>
+            </w:r>
+            <w:r>
+              <w:rPr>
+                <w:rFonts w:ascii="Times New Roman" w:hAnsi="Times New Roman" w:cs="Times New Roman"/>
+                <w:color w:val="000000" w:themeColor="text1"/>
+                <w:sz w:val="20"/>
+                <w:szCs w:val="20"/>
+                <w:lang w:val="en-ZA"/>
+              </w:rPr>
+              <w:t>20940</w:t>
+            </w:r>
+            <w:r>
+              <w:rPr>
+                <w:rFonts w:ascii="Times New Roman" w:hAnsi="Times New Roman" w:cs="Times New Roman"/>
+                <w:color w:val="000000" w:themeColor="text1"/>
+                <w:sz w:val="20"/>
+                <w:szCs w:val="20"/>
+                <w:lang w:val="en-ZA"/>
+              </w:rPr>
+              <w:t>)</w:t>
             </w:r>
             <w:r>
               <w:rPr>
@@ -5740,7 +5704,6 @@
           <w:szCs w:val="22"/>
         </w:rPr>
       </w:pPr>
-      <w:proofErr w:type="spellStart"/>
       <w:r>
         <w:rPr>
           <w:rFonts w:ascii="Times New Roman" w:eastAsia="Calibri" w:hAnsi="Times New Roman" w:cs="Times New Roman"/>
@@ -5750,19 +5713,7 @@
           <w:sz w:val="22"/>
           <w:szCs w:val="22"/>
         </w:rPr>
-        <w:t>matric_plus</w:t>
-      </w:r>
-      <w:proofErr w:type="spellEnd"/>
-      <w:r>
-        <w:rPr>
-          <w:rFonts w:ascii="Times New Roman" w:eastAsia="Calibri" w:hAnsi="Times New Roman" w:cs="Times New Roman"/>
-          <w:b/>
-          <w:bCs/>
-          <w:color w:val="000000" w:themeColor="text1"/>
-          <w:sz w:val="22"/>
-          <w:szCs w:val="22"/>
-        </w:rPr>
-        <w:t>,</w:t>
+        <w:t>matric_plus,</w:t>
       </w:r>
       <w:r>
         <w:rPr>
@@ -5789,7 +5740,6 @@
           <w:szCs w:val="22"/>
         </w:rPr>
       </w:pPr>
-      <w:proofErr w:type="spellStart"/>
       <w:r>
         <w:rPr>
           <w:rFonts w:ascii="Times New Roman" w:eastAsia="Calibri" w:hAnsi="Times New Roman" w:cs="Times New Roman"/>
@@ -5801,7 +5751,6 @@
         </w:rPr>
         <w:t>any_home_internet</w:t>
       </w:r>
-      <w:proofErr w:type="spellEnd"/>
       <w:r>
         <w:rPr>
           <w:rFonts w:ascii="Times New Roman" w:eastAsia="Calibri" w:hAnsi="Times New Roman" w:cs="Times New Roman"/>
@@ -5863,7 +5812,6 @@
           <w:szCs w:val="22"/>
         </w:rPr>
       </w:pPr>
-      <w:proofErr w:type="spellStart"/>
       <w:r>
         <w:rPr>
           <w:rFonts w:ascii="Times New Roman" w:eastAsia="Calibri" w:hAnsi="Times New Roman" w:cs="Times New Roman"/>
@@ -5875,7 +5823,6 @@
         </w:rPr>
         <w:t>age_centred</w:t>
       </w:r>
-      <w:proofErr w:type="spellEnd"/>
       <w:r>
         <w:rPr>
           <w:rFonts w:ascii="Times New Roman" w:eastAsia="Calibri" w:hAnsi="Times New Roman" w:cs="Times New Roman"/>
@@ -5901,7 +5848,6 @@
           <w:szCs w:val="22"/>
         </w:rPr>
       </w:pPr>
-      <w:proofErr w:type="spellStart"/>
       <w:r>
         <w:rPr>
           <w:rFonts w:ascii="Times New Roman" w:eastAsia="Calibri" w:hAnsi="Times New Roman" w:cs="Times New Roman"/>
@@ -5913,7 +5859,6 @@
         </w:rPr>
         <w:t>settlement_type</w:t>
       </w:r>
-      <w:proofErr w:type="spellEnd"/>
       <w:r>
         <w:rPr>
           <w:rFonts w:ascii="Times New Roman" w:eastAsia="Calibri" w:hAnsi="Times New Roman" w:cs="Times New Roman"/>
@@ -5939,7 +5884,6 @@
           <w:szCs w:val="22"/>
         </w:rPr>
       </w:pPr>
-      <w:proofErr w:type="spellStart"/>
       <w:r>
         <w:rPr>
           <w:rFonts w:ascii="Times New Roman" w:eastAsia="Calibri" w:hAnsi="Times New Roman" w:cs="Times New Roman"/>
@@ -5951,7 +5895,6 @@
         </w:rPr>
         <w:t>log_salary</w:t>
       </w:r>
-      <w:proofErr w:type="spellEnd"/>
       <w:r>
         <w:rPr>
           <w:rFonts w:ascii="Times New Roman" w:eastAsia="Calibri" w:hAnsi="Times New Roman" w:cs="Times New Roman"/>
@@ -6149,25 +6092,7 @@
           <w:sz w:val="22"/>
           <w:szCs w:val="22"/>
         </w:rPr>
-        <w:t xml:space="preserve"> done in R</w:t>
-      </w:r>
-      <w:r>
-        <w:rPr>
-          <w:rFonts w:ascii="Times New Roman" w:eastAsia="Calibri" w:hAnsi="Times New Roman" w:cs="Times New Roman"/>
-          <w:color w:val="000000" w:themeColor="text1"/>
-          <w:sz w:val="22"/>
-          <w:szCs w:val="22"/>
-        </w:rPr>
-        <w:t>.</w:t>
-      </w:r>
-      <w:r>
-        <w:rPr>
-          <w:rFonts w:ascii="Times New Roman" w:eastAsia="Calibri" w:hAnsi="Times New Roman" w:cs="Times New Roman"/>
-          <w:color w:val="000000" w:themeColor="text1"/>
-          <w:sz w:val="22"/>
-          <w:szCs w:val="22"/>
-        </w:rPr>
-        <w:t xml:space="preserve"> </w:t>
+        <w:t xml:space="preserve"> done in R. </w:t>
       </w:r>
     </w:p>
     <w:p>
@@ -6537,27 +6462,7 @@
                 <w:sz w:val="20"/>
                 <w:szCs w:val="20"/>
               </w:rPr>
-              <w:t xml:space="preserve">Captures complex patterns the regression cannot, which shows how </w:t>
-            </w:r>
-            <w:proofErr w:type="gramStart"/>
-            <w:r>
-              <w:rPr>
-                <w:rFonts w:ascii="Times New Roman" w:hAnsi="Times New Roman" w:cs="Times New Roman"/>
-                <w:color w:val="000000" w:themeColor="text1"/>
-                <w:sz w:val="20"/>
-                <w:szCs w:val="20"/>
-              </w:rPr>
-              <w:t>much accuracy</w:t>
-            </w:r>
-            <w:proofErr w:type="gramEnd"/>
-            <w:r>
-              <w:rPr>
-                <w:rFonts w:ascii="Times New Roman" w:hAnsi="Times New Roman" w:cs="Times New Roman"/>
-                <w:color w:val="000000" w:themeColor="text1"/>
-                <w:sz w:val="20"/>
-                <w:szCs w:val="20"/>
-              </w:rPr>
-              <w:t xml:space="preserve"> the simpler model gives up.</w:t>
+              <w:t>Captures complex patterns the regression cannot, which shows how much accuracy the simpler model gives up.</w:t>
             </w:r>
           </w:p>
         </w:tc>
@@ -6661,25 +6566,7 @@
           <w:sz w:val="22"/>
           <w:szCs w:val="22"/>
         </w:rPr>
-        <w:t>All employment models use the same 15 predictors, so the comparison is fair. The logistic regression, fitted with the survey package</w:t>
-      </w:r>
-      <w:r>
-        <w:rPr>
-          <w:rFonts w:ascii="Times New Roman" w:eastAsia="Calibri" w:hAnsi="Times New Roman" w:cs="Times New Roman"/>
-          <w:color w:val="000000" w:themeColor="text1"/>
-          <w:sz w:val="22"/>
-          <w:szCs w:val="22"/>
-        </w:rPr>
-        <w:t>,</w:t>
-      </w:r>
-      <w:r>
-        <w:rPr>
-          <w:rFonts w:ascii="Times New Roman" w:eastAsia="Calibri" w:hAnsi="Times New Roman" w:cs="Times New Roman"/>
-          <w:color w:val="000000" w:themeColor="text1"/>
-          <w:sz w:val="22"/>
-          <w:szCs w:val="22"/>
-        </w:rPr>
-        <w:t xml:space="preserve"> adds the interaction between matric and home internet as an explicit </w:t>
+        <w:t xml:space="preserve">All employment models use the same 15 predictors, so the comparison is fair. The logistic regression, fitted with the survey package, adds the interaction between matric and home internet as an explicit </w:t>
       </w:r>
       <w:r>
         <w:rPr>
@@ -6848,43 +6735,7 @@
           <w:sz w:val="22"/>
           <w:szCs w:val="22"/>
         </w:rPr>
-        <w:t>. The decision tree’s depth, minimum group size and pruning level were tuned over 36 combinations, and the simplest tree within one standard error of the best was kept</w:t>
-      </w:r>
-      <w:r>
-        <w:rPr>
-          <w:rFonts w:ascii="Times New Roman" w:eastAsia="Calibri" w:hAnsi="Times New Roman" w:cs="Times New Roman"/>
-          <w:color w:val="000000" w:themeColor="text1"/>
-          <w:sz w:val="22"/>
-          <w:szCs w:val="22"/>
-        </w:rPr>
-        <w:t>,</w:t>
-      </w:r>
-      <w:r>
-        <w:rPr>
-          <w:rFonts w:ascii="Times New Roman" w:eastAsia="Calibri" w:hAnsi="Times New Roman" w:cs="Times New Roman"/>
-          <w:color w:val="000000" w:themeColor="text1"/>
-          <w:sz w:val="22"/>
-          <w:szCs w:val="22"/>
-        </w:rPr>
-        <w:t xml:space="preserve"> because the tree was chosen for readability</w:t>
-      </w:r>
-      <w:r>
-        <w:rPr>
-          <w:rFonts w:ascii="Times New Roman" w:eastAsia="Calibri" w:hAnsi="Times New Roman" w:cs="Times New Roman"/>
-          <w:color w:val="000000" w:themeColor="text1"/>
-          <w:sz w:val="22"/>
-          <w:szCs w:val="22"/>
-        </w:rPr>
-        <w:t>.</w:t>
-      </w:r>
-      <w:r>
-        <w:rPr>
-          <w:rFonts w:ascii="Times New Roman" w:eastAsia="Calibri" w:hAnsi="Times New Roman" w:cs="Times New Roman"/>
-          <w:color w:val="000000" w:themeColor="text1"/>
-          <w:sz w:val="22"/>
-          <w:szCs w:val="22"/>
-        </w:rPr>
-        <w:t xml:space="preserve"> The random forest’s main settings were tuned for the highest cross-validated AUC. </w:t>
+        <w:t xml:space="preserve">. The decision tree’s depth, minimum group size and pruning level were tuned over 36 combinations, and the simplest tree within one standard error of the best was kept, because the tree was chosen for readability. The random forest’s main settings were tuned for the highest cross-validated AUC. </w:t>
       </w:r>
       <w:r>
         <w:rPr>
@@ -6902,27 +6753,7 @@
           <w:sz w:val="22"/>
           <w:szCs w:val="22"/>
         </w:rPr>
-        <w:t xml:space="preserve"> 65% of people are employed, the usual probability cutoff of 0.5 labels almost everyone as employed. Each model’s cutoff was therefore tuned on the training folds to give equal weight to employed and unemployed people. For the logistic regression a cutoff of 0.639 raised the share of unemployed people correctly identified from 46% to 68%. The test set was used only once, after </w:t>
-      </w:r>
-      <w:proofErr w:type="gramStart"/>
-      <w:r>
-        <w:rPr>
-          <w:rFonts w:ascii="Times New Roman" w:eastAsia="Calibri" w:hAnsi="Times New Roman" w:cs="Times New Roman"/>
-          <w:color w:val="000000" w:themeColor="text1"/>
-          <w:sz w:val="22"/>
-          <w:szCs w:val="22"/>
-        </w:rPr>
-        <w:t>all of</w:t>
-      </w:r>
-      <w:proofErr w:type="gramEnd"/>
-      <w:r>
-        <w:rPr>
-          <w:rFonts w:ascii="Times New Roman" w:eastAsia="Calibri" w:hAnsi="Times New Roman" w:cs="Times New Roman"/>
-          <w:color w:val="000000" w:themeColor="text1"/>
-          <w:sz w:val="22"/>
-          <w:szCs w:val="22"/>
-        </w:rPr>
-        <w:t xml:space="preserve"> these choices were fixed.</w:t>
+        <w:t xml:space="preserve"> 65% of people are employed, the usual probability cutoff of 0.5 labels almost everyone as employed. Each model’s cutoff was therefore tuned on the training folds to give equal weight to employed and unemployed people. For the logistic regression a cutoff of 0.639 raised the share of unemployed people correctly identified from 46% to 68%. The test set was used only once, after all of these choices were fixed.</w:t>
       </w:r>
     </w:p>
     <w:p>
@@ -7840,45 +7671,7 @@
           <w:sz w:val="22"/>
           <w:szCs w:val="22"/>
         </w:rPr>
-        <w:t xml:space="preserve">comparison with the baseline does. The logistic regression scores 0.038 higher and a DeLong test run with the </w:t>
-      </w:r>
-      <w:proofErr w:type="spellStart"/>
-      <w:r>
-        <w:rPr>
-          <w:rFonts w:ascii="Times New Roman" w:eastAsia="Calibri" w:hAnsi="Times New Roman" w:cs="Times New Roman"/>
-          <w:color w:val="000000" w:themeColor="text1"/>
-          <w:sz w:val="22"/>
-          <w:szCs w:val="22"/>
-        </w:rPr>
-        <w:t>pROC</w:t>
-      </w:r>
-      <w:proofErr w:type="spellEnd"/>
-      <w:r>
-        <w:rPr>
-          <w:rFonts w:ascii="Times New Roman" w:eastAsia="Calibri" w:hAnsi="Times New Roman" w:cs="Times New Roman"/>
-          <w:color w:val="000000" w:themeColor="text1"/>
-          <w:sz w:val="22"/>
-          <w:szCs w:val="22"/>
-        </w:rPr>
-        <w:t xml:space="preserve"> package shows this is very unlikely to be chance</w:t>
-      </w:r>
-      <w:r>
-        <w:rPr>
-          <w:rFonts w:ascii="Times New Roman" w:eastAsia="Calibri" w:hAnsi="Times New Roman" w:cs="Times New Roman"/>
-          <w:color w:val="000000" w:themeColor="text1"/>
-          <w:sz w:val="22"/>
-          <w:szCs w:val="22"/>
-        </w:rPr>
-        <w:t>,</w:t>
-      </w:r>
-      <w:r>
-        <w:rPr>
-          <w:rFonts w:ascii="Times New Roman" w:eastAsia="Calibri" w:hAnsi="Times New Roman" w:cs="Times New Roman"/>
-          <w:color w:val="000000" w:themeColor="text1"/>
-          <w:sz w:val="22"/>
-          <w:szCs w:val="22"/>
-        </w:rPr>
-        <w:t xml:space="preserve"> with p below 0.0001</w:t>
+        <w:t>comparison with the baseline does. The logistic regression scores 0.038 higher and a DeLong test run with the pROC package shows this is very unlikely to be chance, with p below 0.0001</w:t>
       </w:r>
       <w:r>
         <w:rPr>
@@ -7952,25 +7745,7 @@
           <w:sz w:val="22"/>
           <w:szCs w:val="22"/>
         </w:rPr>
-        <w:t xml:space="preserve"> In the logistic regression, the interaction between matric and home internet has an odds ratio of 1.29, with a 95% confidence interval of 1.06 to 1.58 and p = 0.013 from a Rao-Scott likelihood-ratio test</w:t>
-      </w:r>
-      <w:r>
-        <w:rPr>
-          <w:rFonts w:ascii="Times New Roman" w:eastAsia="Calibri" w:hAnsi="Times New Roman" w:cs="Times New Roman"/>
-          <w:color w:val="000000" w:themeColor="text1"/>
-          <w:sz w:val="22"/>
-          <w:szCs w:val="22"/>
-        </w:rPr>
-        <w:t>,</w:t>
-      </w:r>
-      <w:r>
-        <w:rPr>
-          <w:rFonts w:ascii="Times New Roman" w:eastAsia="Calibri" w:hAnsi="Times New Roman" w:cs="Times New Roman"/>
-          <w:color w:val="000000" w:themeColor="text1"/>
-          <w:sz w:val="22"/>
-          <w:szCs w:val="22"/>
-        </w:rPr>
-        <w:t xml:space="preserve"> which adjusts for the survey desig</w:t>
+        <w:t xml:space="preserve"> In the logistic regression, the interaction between matric and home internet has an odds ratio of 1.29, with a 95% confidence interval of 1.06 to 1.58 and p = 0.013 from a Rao-Scott likelihood-ratio test, which adjusts for the survey desig</w:t>
       </w:r>
       <w:r>
         <w:rPr>
@@ -8495,17 +8270,7 @@
           <w:sz w:val="22"/>
           <w:szCs w:val="22"/>
         </w:rPr>
-        <w:t xml:space="preserve"> Both income models beat their </w:t>
-      </w:r>
-      <w:proofErr w:type="gramStart"/>
-      <w:r>
-        <w:rPr>
-          <w:rFonts w:ascii="Times New Roman" w:eastAsia="Calibri" w:hAnsi="Times New Roman" w:cs="Times New Roman"/>
-          <w:color w:val="000000" w:themeColor="text1"/>
-          <w:sz w:val="22"/>
-          <w:szCs w:val="22"/>
-        </w:rPr>
-        <w:t>baselines</w:t>
+        <w:t xml:space="preserve"> Both income models beat their baselines</w:t>
       </w:r>
       <w:r>
         <w:rPr>
@@ -8523,17 +8288,7 @@
           <w:sz w:val="22"/>
           <w:szCs w:val="22"/>
         </w:rPr>
-        <w:t xml:space="preserve"> but</w:t>
-      </w:r>
-      <w:proofErr w:type="gramEnd"/>
-      <w:r>
-        <w:rPr>
-          <w:rFonts w:ascii="Times New Roman" w:eastAsia="Calibri" w:hAnsi="Times New Roman" w:cs="Times New Roman"/>
-          <w:color w:val="000000" w:themeColor="text1"/>
-          <w:sz w:val="22"/>
-          <w:szCs w:val="22"/>
-        </w:rPr>
-        <w:t xml:space="preserve"> explain only about 30% of the differences in log salary, with an R² of 0.30 for the regression and 0.32 for the random forest. The interaction was not significant for salary, at +3.1% with p = 0.60. Among people who have a job, there is no evidence that </w:t>
+        <w:t xml:space="preserve"> but explain only about 30% of the differences in log salary, with an R² of 0.30 for the regression and 0.32 for the random forest. The interaction was not significant for salary, at +3.1% with p = 0.60. Among people who have a job, there is no evidence that </w:t>
       </w:r>
       <w:r>
         <w:rPr>
@@ -8602,17 +8357,7 @@
           <w:sz w:val="22"/>
           <w:szCs w:val="22"/>
         </w:rPr>
-        <w:t xml:space="preserve"> </w:t>
-      </w:r>
-      <w:proofErr w:type="gramStart"/>
-      <w:r>
-        <w:rPr>
-          <w:rFonts w:ascii="Times New Roman" w:eastAsia="Calibri" w:hAnsi="Times New Roman" w:cs="Times New Roman"/>
-          <w:color w:val="000000" w:themeColor="text1"/>
-          <w:sz w:val="22"/>
-          <w:szCs w:val="22"/>
-        </w:rPr>
-        <w:t>model’</w:t>
+        <w:t xml:space="preserve"> model’</w:t>
       </w:r>
       <w:r>
         <w:rPr>
@@ -8623,7 +8368,6 @@
         </w:rPr>
         <w:t>s</w:t>
       </w:r>
-      <w:proofErr w:type="gramEnd"/>
       <w:r>
         <w:rPr>
           <w:rFonts w:ascii="Times New Roman" w:eastAsia="Calibri" w:hAnsi="Times New Roman" w:cs="Times New Roman"/>
@@ -8713,27 +8457,7 @@
           <w:sz w:val="22"/>
           <w:szCs w:val="22"/>
         </w:rPr>
-        <w:t xml:space="preserve">The selected employment model is deployed as an interactive R Shiny app. Shiny was chosen because it runs the model in the same R environment it was built in and can validate, score and monitor new data. A plumber or vetiver API has no screens for </w:t>
-      </w:r>
-      <w:proofErr w:type="gramStart"/>
-      <w:r>
-        <w:rPr>
-          <w:rFonts w:ascii="Times New Roman" w:eastAsia="Calibri" w:hAnsi="Times New Roman" w:cs="Times New Roman"/>
-          <w:color w:val="000000" w:themeColor="text1"/>
-          <w:sz w:val="22"/>
-          <w:szCs w:val="22"/>
-        </w:rPr>
-        <w:t>analysts,</w:t>
-      </w:r>
-      <w:proofErr w:type="gramEnd"/>
-      <w:r>
-        <w:rPr>
-          <w:rFonts w:ascii="Times New Roman" w:eastAsia="Calibri" w:hAnsi="Times New Roman" w:cs="Times New Roman"/>
-          <w:color w:val="000000" w:themeColor="text1"/>
-          <w:sz w:val="22"/>
-          <w:szCs w:val="22"/>
-        </w:rPr>
-        <w:t xml:space="preserve"> a static Quarto dashboard cannot check uploaded data</w:t>
+        <w:t>The selected employment model is deployed as an interactive R Shiny app. Shiny was chosen because it runs the model in the same R environment it was built in and can validate, score and monitor new data. A plumber or vetiver API has no screens for analysts, a static Quarto dashboard cannot check uploaded data</w:t>
       </w:r>
       <w:r>
         <w:rPr>
@@ -8877,27 +8601,7 @@
           <w:sz w:val="22"/>
           <w:szCs w:val="22"/>
         </w:rPr>
-        <w:t xml:space="preserve"> </w:t>
-      </w:r>
-      <w:proofErr w:type="gramStart"/>
-      <w:r>
-        <w:rPr>
-          <w:rFonts w:ascii="Times New Roman" w:eastAsia="Calibri" w:hAnsi="Times New Roman" w:cs="Times New Roman"/>
-          <w:color w:val="000000" w:themeColor="text1"/>
-          <w:sz w:val="22"/>
-          <w:szCs w:val="22"/>
-        </w:rPr>
-        <w:t>shows</w:t>
-      </w:r>
-      <w:proofErr w:type="gramEnd"/>
-      <w:r>
-        <w:rPr>
-          <w:rFonts w:ascii="Times New Roman" w:eastAsia="Calibri" w:hAnsi="Times New Roman" w:cs="Times New Roman"/>
-          <w:color w:val="000000" w:themeColor="text1"/>
-          <w:sz w:val="22"/>
-          <w:szCs w:val="22"/>
-        </w:rPr>
-        <w:t xml:space="preserve"> what the model implies if a chosen share of people had home internet. It is labelled clearly as a “what if” and not a forecast.</w:t>
+        <w:t xml:space="preserve"> shows what the model implies if a chosen share of people had home internet. It is labelled clearly as a “what if” and not a forecast.</w:t>
       </w:r>
     </w:p>
     <w:p>
@@ -9151,25 +8855,32 @@
         </w:rPr>
         <w:t xml:space="preserve"> </w:t>
       </w:r>
-      <w:proofErr w:type="gramStart"/>
-      <w:r>
-        <w:rPr>
-          <w:rFonts w:ascii="Times New Roman" w:eastAsia="Calibri" w:hAnsi="Times New Roman" w:cs="Times New Roman"/>
-          <w:color w:val="000000" w:themeColor="text1"/>
-          <w:sz w:val="22"/>
-          <w:szCs w:val="22"/>
-        </w:rPr>
-        <w:t>age</w:t>
-      </w:r>
-      <w:proofErr w:type="gramEnd"/>
-      <w:r>
-        <w:rPr>
-          <w:rFonts w:ascii="Times New Roman" w:eastAsia="Calibri" w:hAnsi="Times New Roman" w:cs="Times New Roman"/>
-          <w:color w:val="000000" w:themeColor="text1"/>
-          <w:sz w:val="22"/>
-          <w:szCs w:val="22"/>
-        </w:rPr>
-        <w:t xml:space="preserve"> people and the model results exported from R. Instead of showing every variable, each page answers one decision question. </w:t>
+      <w:r>
+        <w:rPr>
+          <w:rFonts w:ascii="Times New Roman" w:eastAsia="Calibri" w:hAnsi="Times New Roman" w:cs="Times New Roman"/>
+          <w:color w:val="000000" w:themeColor="text1"/>
+          <w:sz w:val="22"/>
+          <w:szCs w:val="22"/>
+        </w:rPr>
+        <w:t xml:space="preserve">age people and the model results </w:t>
+      </w:r>
+      <w:r>
+        <w:rPr>
+          <w:rFonts w:ascii="Times New Roman" w:eastAsia="Calibri" w:hAnsi="Times New Roman" w:cs="Times New Roman"/>
+          <w:color w:val="000000" w:themeColor="text1"/>
+          <w:sz w:val="22"/>
+          <w:szCs w:val="22"/>
+        </w:rPr>
+        <w:t>from the evaluation notebook and the Shiny app, entered as small summary tables</w:t>
+      </w:r>
+      <w:r>
+        <w:rPr>
+          <w:rFonts w:ascii="Times New Roman" w:eastAsia="Calibri" w:hAnsi="Times New Roman" w:cs="Times New Roman"/>
+          <w:color w:val="000000" w:themeColor="text1"/>
+          <w:sz w:val="22"/>
+          <w:szCs w:val="22"/>
+        </w:rPr>
+        <w:t xml:space="preserve">. Instead of showing every variable, each page answers one decision question. </w:t>
       </w:r>
     </w:p>
     <w:tbl>
@@ -9735,25 +9446,7 @@
                 <w:color w:val="000000" w:themeColor="text1"/>
                 <w:lang w:val="en-ZA"/>
               </w:rPr>
-              <w:t xml:space="preserve">Where would more </w:t>
-            </w:r>
-            <w:proofErr w:type="gramStart"/>
-            <w:r>
-              <w:rPr>
-                <w:rFonts w:ascii="Times New Roman" w:hAnsi="Times New Roman" w:cs="Times New Roman"/>
-                <w:color w:val="000000" w:themeColor="text1"/>
-                <w:lang w:val="en-ZA"/>
-              </w:rPr>
-              <w:t>internet</w:t>
-            </w:r>
-            <w:proofErr w:type="gramEnd"/>
-            <w:r>
-              <w:rPr>
-                <w:rFonts w:ascii="Times New Roman" w:hAnsi="Times New Roman" w:cs="Times New Roman"/>
-                <w:color w:val="000000" w:themeColor="text1"/>
-                <w:lang w:val="en-ZA"/>
-              </w:rPr>
-              <w:t xml:space="preserve"> access help most?</w:t>
+              <w:t>Where would more internet access help most?</w:t>
             </w:r>
           </w:p>
         </w:tc>
@@ -9818,18 +9511,8 @@
                 <w:color w:val="000000" w:themeColor="text1"/>
                 <w:lang w:val="en-ZA"/>
               </w:rPr>
-              <w:t xml:space="preserve">Model and </w:t>
-            </w:r>
-            <w:proofErr w:type="gramStart"/>
-            <w:r>
-              <w:rPr>
-                <w:rFonts w:ascii="Times New Roman" w:hAnsi="Times New Roman" w:cs="Times New Roman"/>
-                <w:color w:val="000000" w:themeColor="text1"/>
-                <w:lang w:val="en-ZA"/>
-              </w:rPr>
-              <w:t>Trust</w:t>
-            </w:r>
-            <w:proofErr w:type="gramEnd"/>
+              <w:t>Model and Trust</w:t>
+            </w:r>
           </w:p>
         </w:tc>
         <w:tc>
@@ -9889,6 +9572,92 @@
                 <w:lang w:val="en-ZA"/>
               </w:rPr>
               <w:t>AUC of all the models and how well the model identifies employed and unemployed people in each population group</w:t>
+            </w:r>
+          </w:p>
+        </w:tc>
+      </w:tr>
+      <w:tr>
+        <w:trPr>
+          <w:cantSplit/>
+        </w:trPr>
+        <w:tc>
+          <w:tcPr>
+            <w:tcW w:w="1901" w:type="dxa"/>
+            <w:tcBorders>
+              <w:top w:val="single" w:sz="4" w:space="0" w:color="auto"/>
+              <w:left w:val="single" w:sz="4" w:space="0" w:color="auto"/>
+              <w:bottom w:val="single" w:sz="4" w:space="0" w:color="auto"/>
+              <w:right w:val="single" w:sz="4" w:space="0" w:color="auto"/>
+            </w:tcBorders>
+          </w:tcPr>
+          <w:p>
+            <w:pPr>
+              <w:spacing w:line="276" w:lineRule="auto"/>
+              <w:rPr>
+                <w:rFonts w:ascii="Times New Roman" w:hAnsi="Times New Roman" w:cs="Times New Roman"/>
+                <w:color w:val="000000" w:themeColor="text1"/>
+              </w:rPr>
+            </w:pPr>
+            <w:r>
+              <w:rPr>
+                <w:rFonts w:ascii="Times New Roman" w:hAnsi="Times New Roman" w:cs="Times New Roman"/>
+                <w:color w:val="000000" w:themeColor="text1"/>
+              </w:rPr>
+              <w:t>About the data</w:t>
+            </w:r>
+          </w:p>
+        </w:tc>
+        <w:tc>
+          <w:tcPr>
+            <w:tcW w:w="2801" w:type="dxa"/>
+            <w:tcBorders>
+              <w:top w:val="single" w:sz="4" w:space="0" w:color="auto"/>
+              <w:left w:val="single" w:sz="4" w:space="0" w:color="auto"/>
+              <w:bottom w:val="single" w:sz="4" w:space="0" w:color="auto"/>
+              <w:right w:val="single" w:sz="4" w:space="0" w:color="auto"/>
+            </w:tcBorders>
+          </w:tcPr>
+          <w:p>
+            <w:pPr>
+              <w:spacing w:line="276" w:lineRule="auto"/>
+              <w:rPr>
+                <w:rFonts w:ascii="Times New Roman" w:hAnsi="Times New Roman" w:cs="Times New Roman"/>
+                <w:color w:val="000000" w:themeColor="text1"/>
+              </w:rPr>
+            </w:pPr>
+            <w:r>
+              <w:rPr>
+                <w:rFonts w:ascii="Times New Roman" w:hAnsi="Times New Roman" w:cs="Times New Roman"/>
+                <w:color w:val="000000" w:themeColor="text1"/>
+              </w:rPr>
+              <w:t>Where do the numbers come from?</w:t>
+            </w:r>
+          </w:p>
+        </w:tc>
+        <w:tc>
+          <w:tcPr>
+            <w:tcW w:w="4328" w:type="dxa"/>
+            <w:tcBorders>
+              <w:top w:val="single" w:sz="4" w:space="0" w:color="auto"/>
+              <w:left w:val="single" w:sz="4" w:space="0" w:color="auto"/>
+              <w:bottom w:val="single" w:sz="4" w:space="0" w:color="auto"/>
+              <w:right w:val="single" w:sz="4" w:space="0" w:color="auto"/>
+            </w:tcBorders>
+          </w:tcPr>
+          <w:p>
+            <w:pPr>
+              <w:spacing w:line="276" w:lineRule="auto"/>
+              <w:rPr>
+                <w:rFonts w:ascii="Times New Roman" w:hAnsi="Times New Roman" w:cs="Times New Roman"/>
+                <w:color w:val="000000" w:themeColor="text1"/>
+              </w:rPr>
+            </w:pPr>
+            <w:r>
+              <w:rPr>
+                <w:rFonts w:ascii="Times New Roman" w:hAnsi="Times New Roman" w:cs="Times New Roman"/>
+                <w:color w:val="000000" w:themeColor="text1"/>
+              </w:rPr>
+              <w:t>Data sources, how rates are weighted, privacy rules, limits and a glossary</w:t>
             </w:r>
           </w:p>
         </w:tc>
@@ -10322,6 +10091,7 @@
                 <w:szCs w:val="20"/>
                 <w:lang w:val="en-ZA"/>
               </w:rPr>
+              <w:lastRenderedPageBreak/>
               <w:t>3. Internet access on its own shows a weak link with employment.</w:t>
             </w:r>
           </w:p>
@@ -10429,7 +10199,6 @@
                 <w:szCs w:val="20"/>
                 <w:lang w:val="en-ZA"/>
               </w:rPr>
-              <w:lastRenderedPageBreak/>
               <w:t>4. Access is lowest in some provinces and in traditional areas.</w:t>
             </w:r>
           </w:p>
@@ -10712,29 +10481,7 @@
                 <w:szCs w:val="20"/>
                 <w:lang w:val="en-ZA"/>
               </w:rPr>
-              <w:t xml:space="preserve">Use the model for group-level planning </w:t>
-            </w:r>
-            <w:proofErr w:type="gramStart"/>
-            <w:r>
-              <w:rPr>
-                <w:rFonts w:ascii="Times New Roman" w:hAnsi="Times New Roman" w:cs="Times New Roman"/>
-                <w:color w:val="000000" w:themeColor="text1"/>
-                <w:sz w:val="20"/>
-                <w:szCs w:val="20"/>
-                <w:lang w:val="en-ZA"/>
-              </w:rPr>
-              <w:t>only, and</w:t>
-            </w:r>
-            <w:proofErr w:type="gramEnd"/>
-            <w:r>
-              <w:rPr>
-                <w:rFonts w:ascii="Times New Roman" w:hAnsi="Times New Roman" w:cs="Times New Roman"/>
-                <w:color w:val="000000" w:themeColor="text1"/>
-                <w:sz w:val="20"/>
-                <w:szCs w:val="20"/>
-                <w:lang w:val="en-ZA"/>
-              </w:rPr>
-              <w:t xml:space="preserve"> always show group accuracy next to headline figures.</w:t>
+              <w:t>Use the model for group-level planning only, and always show group accuracy next to headline figures.</w:t>
             </w:r>
           </w:p>
         </w:tc>
@@ -11563,29 +11310,7 @@
                 <w:szCs w:val="20"/>
                 <w:lang w:val="en-ZA"/>
               </w:rPr>
-              <w:t xml:space="preserve">Removed </w:t>
-            </w:r>
-            <w:proofErr w:type="spellStart"/>
-            <w:r>
-              <w:rPr>
-                <w:rFonts w:ascii="Times New Roman" w:hAnsi="Times New Roman" w:cs="Times New Roman"/>
-                <w:color w:val="000000" w:themeColor="text1"/>
-                <w:sz w:val="20"/>
-                <w:szCs w:val="20"/>
-                <w:lang w:val="en-ZA"/>
-              </w:rPr>
-              <w:t>metro_code</w:t>
-            </w:r>
-            <w:proofErr w:type="spellEnd"/>
-            <w:r>
-              <w:rPr>
-                <w:rFonts w:ascii="Times New Roman" w:hAnsi="Times New Roman" w:cs="Times New Roman"/>
-                <w:color w:val="000000" w:themeColor="text1"/>
-                <w:sz w:val="20"/>
-                <w:szCs w:val="20"/>
-                <w:lang w:val="en-ZA"/>
-              </w:rPr>
-              <w:t>, which splits provinces into 17 municipalities. Household IDs are used only for joining and splitting, never as predictors.</w:t>
+              <w:t>Removed metro_code, which splits provinces into 17 municipalities. Household IDs are used only for joining and splitting, never as predictors.</w:t>
             </w:r>
           </w:p>
         </w:tc>
@@ -11993,7 +11718,25 @@
           <w:sz w:val="22"/>
           <w:szCs w:val="22"/>
         </w:rPr>
-        <w:t xml:space="preserve"> The team used Claude, an AI assistant, to help debug and validate R code, build the Shiny app and its synthetic test file, check how results were interpreted, and improve the wording and structure of the documentation, including this report and the presentation. All AI-assisted code was rerun and checked against the R output, and all text was read and corrected by the team. The full usage log is in Appendix B.</w:t>
+        <w:t xml:space="preserve"> The team used Claude, an AI assistant, to help debug and validate R code, build the Shiny app and its synthetic test file, check how results were interpreted, and improve the wording and structure of the documentation, including this report and the presentation. All AI-assisted code was rerun and checked against the R output, and all text was read and corrected by the team. The full usage log is in Appendix </w:t>
+      </w:r>
+      <w:r>
+        <w:rPr>
+          <w:rFonts w:ascii="Times New Roman" w:eastAsia="Calibri" w:hAnsi="Times New Roman" w:cs="Times New Roman"/>
+          <w:color w:val="000000" w:themeColor="text1"/>
+          <w:sz w:val="22"/>
+          <w:szCs w:val="22"/>
+        </w:rPr>
+        <w:t>D</w:t>
+      </w:r>
+      <w:r>
+        <w:rPr>
+          <w:rFonts w:ascii="Times New Roman" w:eastAsia="Calibri" w:hAnsi="Times New Roman" w:cs="Times New Roman"/>
+          <w:color w:val="000000" w:themeColor="text1"/>
+          <w:sz w:val="22"/>
+          <w:szCs w:val="22"/>
+        </w:rPr>
+        <w:t>.</w:t>
       </w:r>
     </w:p>
     <w:p>
@@ -12263,45 +12006,14 @@
           <w:szCs w:val="22"/>
         </w:rPr>
       </w:pPr>
-      <w:proofErr w:type="spellStart"/>
-      <w:r>
-        <w:rPr>
-          <w:rFonts w:ascii="Times New Roman" w:eastAsia="Calibri" w:hAnsi="Times New Roman" w:cs="Times New Roman"/>
-          <w:color w:val="000000" w:themeColor="text1"/>
-          <w:sz w:val="22"/>
-          <w:szCs w:val="22"/>
-        </w:rPr>
-        <w:t>Breiman</w:t>
-      </w:r>
-      <w:proofErr w:type="spellEnd"/>
-      <w:r>
-        <w:rPr>
-          <w:rFonts w:ascii="Times New Roman" w:eastAsia="Calibri" w:hAnsi="Times New Roman" w:cs="Times New Roman"/>
-          <w:color w:val="000000" w:themeColor="text1"/>
-          <w:sz w:val="22"/>
-          <w:szCs w:val="22"/>
-        </w:rPr>
-        <w:t xml:space="preserve">, L., Friedman, J.H., </w:t>
-      </w:r>
-      <w:proofErr w:type="spellStart"/>
-      <w:r>
-        <w:rPr>
-          <w:rFonts w:ascii="Times New Roman" w:eastAsia="Calibri" w:hAnsi="Times New Roman" w:cs="Times New Roman"/>
-          <w:color w:val="000000" w:themeColor="text1"/>
-          <w:sz w:val="22"/>
-          <w:szCs w:val="22"/>
-        </w:rPr>
-        <w:t>Olshen</w:t>
-      </w:r>
-      <w:proofErr w:type="spellEnd"/>
-      <w:r>
-        <w:rPr>
-          <w:rFonts w:ascii="Times New Roman" w:eastAsia="Calibri" w:hAnsi="Times New Roman" w:cs="Times New Roman"/>
-          <w:color w:val="000000" w:themeColor="text1"/>
-          <w:sz w:val="22"/>
-          <w:szCs w:val="22"/>
-        </w:rPr>
-        <w:t xml:space="preserve">, R.A. and Stone, C.J., 1984. </w:t>
+      <w:r>
+        <w:rPr>
+          <w:rFonts w:ascii="Times New Roman" w:eastAsia="Calibri" w:hAnsi="Times New Roman" w:cs="Times New Roman"/>
+          <w:color w:val="000000" w:themeColor="text1"/>
+          <w:sz w:val="22"/>
+          <w:szCs w:val="22"/>
+        </w:rPr>
+        <w:t xml:space="preserve">Breiman, L., Friedman, J.H., Olshen, R.A. and Stone, C.J., 1984. </w:t>
       </w:r>
       <w:r>
         <w:rPr>
@@ -12570,25 +12282,14 @@
           <w:szCs w:val="22"/>
         </w:rPr>
       </w:pPr>
-      <w:proofErr w:type="spellStart"/>
-      <w:r>
-        <w:rPr>
-          <w:rFonts w:ascii="Times New Roman" w:eastAsia="Calibri" w:hAnsi="Times New Roman" w:cs="Times New Roman"/>
-          <w:color w:val="000000" w:themeColor="text1"/>
-          <w:sz w:val="22"/>
-          <w:szCs w:val="22"/>
-        </w:rPr>
-        <w:t>Oyedemi</w:t>
-      </w:r>
-      <w:proofErr w:type="spellEnd"/>
-      <w:r>
-        <w:rPr>
-          <w:rFonts w:ascii="Times New Roman" w:eastAsia="Calibri" w:hAnsi="Times New Roman" w:cs="Times New Roman"/>
-          <w:color w:val="000000" w:themeColor="text1"/>
-          <w:sz w:val="22"/>
-          <w:szCs w:val="22"/>
-        </w:rPr>
-        <w:t xml:space="preserve">, T. and Choung, H., 2020. The social relevance of mobile phone ownership and internet use in South Africa. </w:t>
+      <w:r>
+        <w:rPr>
+          <w:rFonts w:ascii="Times New Roman" w:eastAsia="Calibri" w:hAnsi="Times New Roman" w:cs="Times New Roman"/>
+          <w:color w:val="000000" w:themeColor="text1"/>
+          <w:sz w:val="22"/>
+          <w:szCs w:val="22"/>
+        </w:rPr>
+        <w:t xml:space="preserve">Oyedemi, T. and Choung, H., 2020. The social relevance of mobile phone ownership and internet use in South Africa. </w:t>
       </w:r>
       <w:r>
         <w:rPr>
@@ -12639,25 +12340,14 @@
           <w:szCs w:val="22"/>
         </w:rPr>
       </w:pPr>
-      <w:proofErr w:type="spellStart"/>
-      <w:r>
-        <w:rPr>
-          <w:rFonts w:ascii="Times New Roman" w:eastAsia="Calibri" w:hAnsi="Times New Roman" w:cs="Times New Roman"/>
-          <w:color w:val="000000" w:themeColor="text1"/>
-          <w:sz w:val="22"/>
-          <w:szCs w:val="22"/>
-        </w:rPr>
-        <w:t>Plavgo</w:t>
-      </w:r>
-      <w:proofErr w:type="spellEnd"/>
-      <w:r>
-        <w:rPr>
-          <w:rFonts w:ascii="Times New Roman" w:eastAsia="Calibri" w:hAnsi="Times New Roman" w:cs="Times New Roman"/>
-          <w:color w:val="000000" w:themeColor="text1"/>
-          <w:sz w:val="22"/>
-          <w:szCs w:val="22"/>
-        </w:rPr>
-        <w:t xml:space="preserve">, I., 2023. Education and active labour market policy complementarities in promoting employment: Reinforcement, substitution and compensation. </w:t>
+      <w:r>
+        <w:rPr>
+          <w:rFonts w:ascii="Times New Roman" w:eastAsia="Calibri" w:hAnsi="Times New Roman" w:cs="Times New Roman"/>
+          <w:color w:val="000000" w:themeColor="text1"/>
+          <w:sz w:val="22"/>
+          <w:szCs w:val="22"/>
+        </w:rPr>
+        <w:t xml:space="preserve">Plavgo, I., 2023. Education and active labour market policy complementarities in promoting employment: Reinforcement, substitution and compensation. </w:t>
       </w:r>
       <w:r>
         <w:rPr>
@@ -13036,19 +12726,20 @@
           <w:sz w:val="20"/>
           <w:szCs w:val="20"/>
         </w:rPr>
-        <w:t>── _</w:t>
-      </w:r>
-      <w:proofErr w:type="spellStart"/>
-      <w:r>
+        <w:t xml:space="preserve">── _quarto.yml     </w:t>
+      </w:r>
+    </w:p>
+    <w:p>
+      <w:pPr>
+        <w:keepNext/>
+        <w:spacing w:before="60" w:after="60" w:line="240" w:lineRule="auto"/>
         <w:rPr>
           <w:rFonts w:ascii="Times New Roman" w:eastAsia="Calibri" w:hAnsi="Times New Roman" w:cs="Times New Roman"/>
           <w:color w:val="000000" w:themeColor="text1"/>
           <w:sz w:val="20"/>
           <w:szCs w:val="20"/>
         </w:rPr>
-        <w:t>quarto.yml</w:t>
-      </w:r>
-      <w:proofErr w:type="spellEnd"/>
+      </w:pPr>
       <w:r>
         <w:rPr>
           <w:rFonts w:ascii="Times New Roman" w:eastAsia="Calibri" w:hAnsi="Times New Roman" w:cs="Times New Roman"/>
@@ -13056,7 +12747,25 @@
           <w:sz w:val="20"/>
           <w:szCs w:val="20"/>
         </w:rPr>
-        <w:t xml:space="preserve">     </w:t>
+        <w:t xml:space="preserve">│   </w:t>
+      </w:r>
+      <w:r>
+        <w:rPr>
+          <w:rFonts w:ascii="Times New Roman" w:eastAsia="MS Gothic" w:hAnsi="Times New Roman" w:cs="Times New Roman"/>
+          <w:color w:val="000000" w:themeColor="text1"/>
+          <w:sz w:val="20"/>
+          <w:szCs w:val="20"/>
+        </w:rPr>
+        <w:t>├</w:t>
+      </w:r>
+      <w:r>
+        <w:rPr>
+          <w:rFonts w:ascii="Times New Roman" w:eastAsia="Calibri" w:hAnsi="Times New Roman" w:cs="Times New Roman"/>
+          <w:color w:val="000000" w:themeColor="text1"/>
+          <w:sz w:val="20"/>
+          <w:szCs w:val="20"/>
+        </w:rPr>
+        <w:t xml:space="preserve">── 1) EDA.qmd              </w:t>
       </w:r>
     </w:p>
     <w:p>
@@ -13095,19 +12804,20 @@
           <w:sz w:val="20"/>
           <w:szCs w:val="20"/>
         </w:rPr>
-        <w:t xml:space="preserve">── 1) </w:t>
-      </w:r>
-      <w:proofErr w:type="spellStart"/>
-      <w:r>
+        <w:t xml:space="preserve">── 2.1) Data Preprocessing.qmd   </w:t>
+      </w:r>
+    </w:p>
+    <w:p>
+      <w:pPr>
+        <w:keepNext/>
+        <w:spacing w:before="60" w:after="60" w:line="240" w:lineRule="auto"/>
         <w:rPr>
           <w:rFonts w:ascii="Times New Roman" w:eastAsia="Calibri" w:hAnsi="Times New Roman" w:cs="Times New Roman"/>
           <w:color w:val="000000" w:themeColor="text1"/>
           <w:sz w:val="20"/>
           <w:szCs w:val="20"/>
         </w:rPr>
-        <w:t>EDA.qmd</w:t>
-      </w:r>
-      <w:proofErr w:type="spellEnd"/>
+      </w:pPr>
       <w:r>
         <w:rPr>
           <w:rFonts w:ascii="Times New Roman" w:eastAsia="Calibri" w:hAnsi="Times New Roman" w:cs="Times New Roman"/>
@@ -13115,7 +12825,25 @@
           <w:sz w:val="20"/>
           <w:szCs w:val="20"/>
         </w:rPr>
-        <w:t xml:space="preserve">              </w:t>
+        <w:t xml:space="preserve">│   </w:t>
+      </w:r>
+      <w:r>
+        <w:rPr>
+          <w:rFonts w:ascii="Times New Roman" w:eastAsia="MS Gothic" w:hAnsi="Times New Roman" w:cs="Times New Roman"/>
+          <w:color w:val="000000" w:themeColor="text1"/>
+          <w:sz w:val="20"/>
+          <w:szCs w:val="20"/>
+        </w:rPr>
+        <w:t>├</w:t>
+      </w:r>
+      <w:r>
+        <w:rPr>
+          <w:rFonts w:ascii="Times New Roman" w:eastAsia="Calibri" w:hAnsi="Times New Roman" w:cs="Times New Roman"/>
+          <w:color w:val="000000" w:themeColor="text1"/>
+          <w:sz w:val="20"/>
+          <w:szCs w:val="20"/>
+        </w:rPr>
+        <w:t xml:space="preserve">── 2.2) Train-Test Split.qmd      </w:t>
       </w:r>
     </w:p>
     <w:p>
@@ -13154,19 +12882,20 @@
           <w:sz w:val="20"/>
           <w:szCs w:val="20"/>
         </w:rPr>
-        <w:t xml:space="preserve">── 2.1) Data </w:t>
-      </w:r>
-      <w:proofErr w:type="spellStart"/>
-      <w:r>
+        <w:t xml:space="preserve">── 3.1) Employment Model.qmd        </w:t>
+      </w:r>
+    </w:p>
+    <w:p>
+      <w:pPr>
+        <w:keepNext/>
+        <w:spacing w:before="60" w:after="60" w:line="240" w:lineRule="auto"/>
         <w:rPr>
           <w:rFonts w:ascii="Times New Roman" w:eastAsia="Calibri" w:hAnsi="Times New Roman" w:cs="Times New Roman"/>
           <w:color w:val="000000" w:themeColor="text1"/>
           <w:sz w:val="20"/>
           <w:szCs w:val="20"/>
         </w:rPr>
-        <w:t>Preprocessing.qmd</w:t>
-      </w:r>
-      <w:proofErr w:type="spellEnd"/>
+      </w:pPr>
       <w:r>
         <w:rPr>
           <w:rFonts w:ascii="Times New Roman" w:eastAsia="Calibri" w:hAnsi="Times New Roman" w:cs="Times New Roman"/>
@@ -13174,7 +12903,25 @@
           <w:sz w:val="20"/>
           <w:szCs w:val="20"/>
         </w:rPr>
-        <w:t xml:space="preserve">   </w:t>
+        <w:t xml:space="preserve">│   </w:t>
+      </w:r>
+      <w:r>
+        <w:rPr>
+          <w:rFonts w:ascii="Times New Roman" w:eastAsia="MS Gothic" w:hAnsi="Times New Roman" w:cs="Times New Roman"/>
+          <w:color w:val="000000" w:themeColor="text1"/>
+          <w:sz w:val="20"/>
+          <w:szCs w:val="20"/>
+        </w:rPr>
+        <w:t>├</w:t>
+      </w:r>
+      <w:r>
+        <w:rPr>
+          <w:rFonts w:ascii="Times New Roman" w:eastAsia="Calibri" w:hAnsi="Times New Roman" w:cs="Times New Roman"/>
+          <w:color w:val="000000" w:themeColor="text1"/>
+          <w:sz w:val="20"/>
+          <w:szCs w:val="20"/>
+        </w:rPr>
+        <w:t xml:space="preserve">── 3.2) Income Model.qmd           </w:t>
       </w:r>
     </w:p>
     <w:p>
@@ -13213,19 +12960,20 @@
           <w:sz w:val="20"/>
           <w:szCs w:val="20"/>
         </w:rPr>
-        <w:t xml:space="preserve">── 2.2) Train-Test </w:t>
-      </w:r>
-      <w:proofErr w:type="spellStart"/>
-      <w:r>
+        <w:t xml:space="preserve">── 3.3) Model Evaluation.qmd        </w:t>
+      </w:r>
+    </w:p>
+    <w:p>
+      <w:pPr>
+        <w:keepNext/>
+        <w:spacing w:before="60" w:after="60" w:line="240" w:lineRule="auto"/>
         <w:rPr>
           <w:rFonts w:ascii="Times New Roman" w:eastAsia="Calibri" w:hAnsi="Times New Roman" w:cs="Times New Roman"/>
           <w:color w:val="000000" w:themeColor="text1"/>
           <w:sz w:val="20"/>
           <w:szCs w:val="20"/>
         </w:rPr>
-        <w:t>Split.qmd</w:t>
-      </w:r>
-      <w:proofErr w:type="spellEnd"/>
+      </w:pPr>
       <w:r>
         <w:rPr>
           <w:rFonts w:ascii="Times New Roman" w:eastAsia="Calibri" w:hAnsi="Times New Roman" w:cs="Times New Roman"/>
@@ -13233,7 +12981,25 @@
           <w:sz w:val="20"/>
           <w:szCs w:val="20"/>
         </w:rPr>
-        <w:t xml:space="preserve">      </w:t>
+        <w:t xml:space="preserve">│   </w:t>
+      </w:r>
+      <w:r>
+        <w:rPr>
+          <w:rFonts w:ascii="Times New Roman" w:eastAsia="MS Gothic" w:hAnsi="Times New Roman" w:cs="Times New Roman"/>
+          <w:color w:val="000000" w:themeColor="text1"/>
+          <w:sz w:val="20"/>
+          <w:szCs w:val="20"/>
+        </w:rPr>
+        <w:t>├</w:t>
+      </w:r>
+      <w:r>
+        <w:rPr>
+          <w:rFonts w:ascii="Times New Roman" w:eastAsia="Calibri" w:hAnsi="Times New Roman" w:cs="Times New Roman"/>
+          <w:color w:val="000000" w:themeColor="text1"/>
+          <w:sz w:val="20"/>
+          <w:szCs w:val="20"/>
+        </w:rPr>
+        <w:t xml:space="preserve">── 3.4) Deployment Preparation.qmd   </w:t>
       </w:r>
     </w:p>
     <w:p>
@@ -13254,17 +13020,20 @@
           <w:sz w:val="20"/>
           <w:szCs w:val="20"/>
         </w:rPr>
-        <w:t xml:space="preserve">│   </w:t>
-      </w:r>
-      <w:r>
-        <w:rPr>
-          <w:rFonts w:ascii="Times New Roman" w:eastAsia="MS Gothic" w:hAnsi="Times New Roman" w:cs="Times New Roman"/>
+        <w:t>│   └── R/</w:t>
+      </w:r>
+    </w:p>
+    <w:p>
+      <w:pPr>
+        <w:keepNext/>
+        <w:spacing w:before="60" w:after="60" w:line="240" w:lineRule="auto"/>
+        <w:rPr>
+          <w:rFonts w:ascii="Times New Roman" w:eastAsia="Calibri" w:hAnsi="Times New Roman" w:cs="Times New Roman"/>
           <w:color w:val="000000" w:themeColor="text1"/>
           <w:sz w:val="20"/>
           <w:szCs w:val="20"/>
         </w:rPr>
-        <w:t>├</w:t>
-      </w:r>
+      </w:pPr>
       <w:r>
         <w:rPr>
           <w:rFonts w:ascii="Times New Roman" w:eastAsia="Calibri" w:hAnsi="Times New Roman" w:cs="Times New Roman"/>
@@ -13272,19 +13041,20 @@
           <w:sz w:val="20"/>
           <w:szCs w:val="20"/>
         </w:rPr>
-        <w:t xml:space="preserve">── 3.1) Employment </w:t>
-      </w:r>
-      <w:proofErr w:type="spellStart"/>
-      <w:r>
+        <w:t xml:space="preserve">│       └── model_preparation.R          </w:t>
+      </w:r>
+    </w:p>
+    <w:p>
+      <w:pPr>
+        <w:keepNext/>
+        <w:spacing w:before="60" w:after="60" w:line="240" w:lineRule="auto"/>
         <w:rPr>
           <w:rFonts w:ascii="Times New Roman" w:eastAsia="Calibri" w:hAnsi="Times New Roman" w:cs="Times New Roman"/>
           <w:color w:val="000000" w:themeColor="text1"/>
           <w:sz w:val="20"/>
           <w:szCs w:val="20"/>
         </w:rPr>
-        <w:t>Model.qmd</w:t>
-      </w:r>
-      <w:proofErr w:type="spellEnd"/>
+      </w:pPr>
       <w:r>
         <w:rPr>
           <w:rFonts w:ascii="Times New Roman" w:eastAsia="Calibri" w:hAnsi="Times New Roman" w:cs="Times New Roman"/>
@@ -13292,7 +13062,7 @@
           <w:sz w:val="20"/>
           <w:szCs w:val="20"/>
         </w:rPr>
-        <w:t xml:space="preserve">        </w:t>
+        <w:t>│</w:t>
       </w:r>
     </w:p>
     <w:p>
@@ -13308,42 +13078,43 @@
       </w:pPr>
       <w:r>
         <w:rPr>
-          <w:rFonts w:ascii="Times New Roman" w:eastAsia="Calibri" w:hAnsi="Times New Roman" w:cs="Times New Roman"/>
+          <w:rFonts w:ascii="Times New Roman" w:eastAsia="MS Gothic" w:hAnsi="Times New Roman" w:cs="Times New Roman"/>
           <w:color w:val="000000" w:themeColor="text1"/>
           <w:sz w:val="20"/>
           <w:szCs w:val="20"/>
         </w:rPr>
-        <w:t xml:space="preserve">│   </w:t>
-      </w:r>
-      <w:r>
-        <w:rPr>
-          <w:rFonts w:ascii="Times New Roman" w:eastAsia="MS Gothic" w:hAnsi="Times New Roman" w:cs="Times New Roman"/>
+        <w:t>├</w:t>
+      </w:r>
+      <w:r>
+        <w:rPr>
+          <w:rFonts w:ascii="Times New Roman" w:eastAsia="Calibri" w:hAnsi="Times New Roman" w:cs="Times New Roman"/>
           <w:color w:val="000000" w:themeColor="text1"/>
           <w:sz w:val="20"/>
           <w:szCs w:val="20"/>
         </w:rPr>
-        <w:t>├</w:t>
-      </w:r>
-      <w:r>
+        <w:t xml:space="preserve">── Shiny-App/                            </w:t>
+      </w:r>
+    </w:p>
+    <w:p>
+      <w:pPr>
+        <w:keepNext/>
+        <w:spacing w:before="60" w:after="60" w:line="240" w:lineRule="auto"/>
         <w:rPr>
           <w:rFonts w:ascii="Times New Roman" w:eastAsia="Calibri" w:hAnsi="Times New Roman" w:cs="Times New Roman"/>
           <w:color w:val="000000" w:themeColor="text1"/>
           <w:sz w:val="20"/>
           <w:szCs w:val="20"/>
         </w:rPr>
-        <w:t xml:space="preserve">── 3.2) Income </w:t>
-      </w:r>
-      <w:proofErr w:type="spellStart"/>
-      <w:r>
-        <w:rPr>
-          <w:rFonts w:ascii="Times New Roman" w:eastAsia="Calibri" w:hAnsi="Times New Roman" w:cs="Times New Roman"/>
+      </w:pPr>
+      <w:r>
+        <w:rPr>
+          <w:rFonts w:ascii="Times New Roman" w:eastAsia="MS Gothic" w:hAnsi="Times New Roman" w:cs="Times New Roman"/>
           <w:color w:val="000000" w:themeColor="text1"/>
           <w:sz w:val="20"/>
           <w:szCs w:val="20"/>
         </w:rPr>
-        <w:t>Model.qmd</w:t>
-      </w:r>
-      <w:proofErr w:type="spellEnd"/>
+        <w:t>├</w:t>
+      </w:r>
       <w:r>
         <w:rPr>
           <w:rFonts w:ascii="Times New Roman" w:eastAsia="Calibri" w:hAnsi="Times New Roman" w:cs="Times New Roman"/>
@@ -13351,7 +13122,7 @@
           <w:sz w:val="20"/>
           <w:szCs w:val="20"/>
         </w:rPr>
-        <w:t xml:space="preserve">           </w:t>
+        <w:t xml:space="preserve">── Models/                            </w:t>
       </w:r>
     </w:p>
     <w:p>
@@ -13367,32 +13138,34 @@
       </w:pPr>
       <w:r>
         <w:rPr>
-          <w:rFonts w:ascii="Times New Roman" w:eastAsia="Calibri" w:hAnsi="Times New Roman" w:cs="Times New Roman"/>
+          <w:rFonts w:ascii="Times New Roman" w:eastAsia="MS Gothic" w:hAnsi="Times New Roman" w:cs="Times New Roman"/>
           <w:color w:val="000000" w:themeColor="text1"/>
           <w:sz w:val="20"/>
           <w:szCs w:val="20"/>
         </w:rPr>
-        <w:t xml:space="preserve">│   </w:t>
-      </w:r>
-      <w:r>
-        <w:rPr>
-          <w:rFonts w:ascii="Times New Roman" w:eastAsia="MS Gothic" w:hAnsi="Times New Roman" w:cs="Times New Roman"/>
+        <w:t>├</w:t>
+      </w:r>
+      <w:r>
+        <w:rPr>
+          <w:rFonts w:ascii="Times New Roman" w:eastAsia="Calibri" w:hAnsi="Times New Roman" w:cs="Times New Roman"/>
           <w:color w:val="000000" w:themeColor="text1"/>
           <w:sz w:val="20"/>
           <w:szCs w:val="20"/>
         </w:rPr>
-        <w:t>├</w:t>
-      </w:r>
-      <w:r>
+        <w:t>── Datasets/</w:t>
+      </w:r>
+    </w:p>
+    <w:p>
+      <w:pPr>
+        <w:keepNext/>
+        <w:spacing w:before="60" w:after="60" w:line="240" w:lineRule="auto"/>
         <w:rPr>
           <w:rFonts w:ascii="Times New Roman" w:eastAsia="Calibri" w:hAnsi="Times New Roman" w:cs="Times New Roman"/>
           <w:color w:val="000000" w:themeColor="text1"/>
           <w:sz w:val="20"/>
           <w:szCs w:val="20"/>
         </w:rPr>
-        <w:t xml:space="preserve">── 3.3) Model </w:t>
-      </w:r>
-      <w:proofErr w:type="spellStart"/>
+      </w:pPr>
       <w:r>
         <w:rPr>
           <w:rFonts w:ascii="Times New Roman" w:eastAsia="Calibri" w:hAnsi="Times New Roman" w:cs="Times New Roman"/>
@@ -13400,17 +13173,25 @@
           <w:sz w:val="20"/>
           <w:szCs w:val="20"/>
         </w:rPr>
-        <w:t>Evaluation.qmd</w:t>
-      </w:r>
-      <w:proofErr w:type="spellEnd"/>
-      <w:r>
-        <w:rPr>
-          <w:rFonts w:ascii="Times New Roman" w:eastAsia="Calibri" w:hAnsi="Times New Roman" w:cs="Times New Roman"/>
+        <w:t xml:space="preserve">│   </w:t>
+      </w:r>
+      <w:r>
+        <w:rPr>
+          <w:rFonts w:ascii="Times New Roman" w:eastAsia="MS Gothic" w:hAnsi="Times New Roman" w:cs="Times New Roman"/>
           <w:color w:val="000000" w:themeColor="text1"/>
           <w:sz w:val="20"/>
           <w:szCs w:val="20"/>
         </w:rPr>
-        <w:t xml:space="preserve">        </w:t>
+        <w:t>├</w:t>
+      </w:r>
+      <w:r>
+        <w:rPr>
+          <w:rFonts w:ascii="Times New Roman" w:eastAsia="Calibri" w:hAnsi="Times New Roman" w:cs="Times New Roman"/>
+          <w:color w:val="000000" w:themeColor="text1"/>
+          <w:sz w:val="20"/>
+          <w:szCs w:val="20"/>
+        </w:rPr>
+        <w:t xml:space="preserve">── D01_…csv – D11_…csv               </w:t>
       </w:r>
     </w:p>
     <w:p>
@@ -13449,19 +13230,20 @@
           <w:sz w:val="20"/>
           <w:szCs w:val="20"/>
         </w:rPr>
-        <w:t xml:space="preserve">── 3.4) Deployment </w:t>
-      </w:r>
-      <w:proofErr w:type="spellStart"/>
-      <w:r>
+        <w:t xml:space="preserve">── Cleaned/                               </w:t>
+      </w:r>
+    </w:p>
+    <w:p>
+      <w:pPr>
+        <w:keepNext/>
+        <w:spacing w:before="60" w:after="60" w:line="240" w:lineRule="auto"/>
         <w:rPr>
           <w:rFonts w:ascii="Times New Roman" w:eastAsia="Calibri" w:hAnsi="Times New Roman" w:cs="Times New Roman"/>
           <w:color w:val="000000" w:themeColor="text1"/>
           <w:sz w:val="20"/>
           <w:szCs w:val="20"/>
         </w:rPr>
-        <w:t>Preparation.qmd</w:t>
-      </w:r>
-      <w:proofErr w:type="spellEnd"/>
+      </w:pPr>
       <w:r>
         <w:rPr>
           <w:rFonts w:ascii="Times New Roman" w:eastAsia="Calibri" w:hAnsi="Times New Roman" w:cs="Times New Roman"/>
@@ -13469,7 +13251,7 @@
           <w:sz w:val="20"/>
           <w:szCs w:val="20"/>
         </w:rPr>
-        <w:t xml:space="preserve">   </w:t>
+        <w:t xml:space="preserve">│   └─ Analytical/                      </w:t>
       </w:r>
     </w:p>
     <w:p>
@@ -13490,7 +13272,7 @@
           <w:sz w:val="20"/>
           <w:szCs w:val="20"/>
         </w:rPr>
-        <w:t>│   └── R/</w:t>
+        <w:t>│</w:t>
       </w:r>
     </w:p>
     <w:p>
@@ -13506,14 +13288,13 @@
       </w:pPr>
       <w:r>
         <w:rPr>
-          <w:rFonts w:ascii="Times New Roman" w:eastAsia="Calibri" w:hAnsi="Times New Roman" w:cs="Times New Roman"/>
+          <w:rFonts w:ascii="Times New Roman" w:eastAsia="MS Gothic" w:hAnsi="Times New Roman" w:cs="Times New Roman"/>
           <w:color w:val="000000" w:themeColor="text1"/>
           <w:sz w:val="20"/>
           <w:szCs w:val="20"/>
         </w:rPr>
-        <w:t xml:space="preserve">│       └── </w:t>
-      </w:r>
-      <w:proofErr w:type="spellStart"/>
+        <w:t>├</w:t>
+      </w:r>
       <w:r>
         <w:rPr>
           <w:rFonts w:ascii="Times New Roman" w:eastAsia="Calibri" w:hAnsi="Times New Roman" w:cs="Times New Roman"/>
@@ -13521,17 +13302,46 @@
           <w:sz w:val="20"/>
           <w:szCs w:val="20"/>
         </w:rPr>
-        <w:t>model_preparation.R</w:t>
-      </w:r>
-      <w:proofErr w:type="spellEnd"/>
-      <w:r>
+        <w:t>── Documentation/</w:t>
+      </w:r>
+    </w:p>
+    <w:p>
+      <w:pPr>
+        <w:keepNext/>
+        <w:spacing w:before="60" w:after="60" w:line="240" w:lineRule="auto"/>
         <w:rPr>
           <w:rFonts w:ascii="Times New Roman" w:eastAsia="Calibri" w:hAnsi="Times New Roman" w:cs="Times New Roman"/>
           <w:color w:val="000000" w:themeColor="text1"/>
           <w:sz w:val="20"/>
           <w:szCs w:val="20"/>
         </w:rPr>
-        <w:t xml:space="preserve">          </w:t>
+      </w:pPr>
+      <w:r>
+        <w:rPr>
+          <w:rFonts w:ascii="Times New Roman" w:eastAsia="Calibri" w:hAnsi="Times New Roman" w:cs="Times New Roman"/>
+          <w:color w:val="000000" w:themeColor="text1"/>
+          <w:sz w:val="20"/>
+          <w:szCs w:val="20"/>
+        </w:rPr>
+        <w:t xml:space="preserve">│   </w:t>
+      </w:r>
+      <w:r>
+        <w:rPr>
+          <w:rFonts w:ascii="Times New Roman" w:eastAsia="MS Gothic" w:hAnsi="Times New Roman" w:cs="Times New Roman"/>
+          <w:color w:val="000000" w:themeColor="text1"/>
+          <w:sz w:val="20"/>
+          <w:szCs w:val="20"/>
+        </w:rPr>
+        <w:t>├</w:t>
+      </w:r>
+      <w:r>
+        <w:rPr>
+          <w:rFonts w:ascii="Times New Roman" w:eastAsia="Calibri" w:hAnsi="Times New Roman" w:cs="Times New Roman"/>
+          <w:color w:val="000000" w:themeColor="text1"/>
+          <w:sz w:val="20"/>
+          <w:szCs w:val="20"/>
+        </w:rPr>
+        <w:t>── Milestone Documentation/</w:t>
       </w:r>
     </w:p>
     <w:p>
@@ -13552,7 +13362,25 @@
           <w:sz w:val="20"/>
           <w:szCs w:val="20"/>
         </w:rPr>
-        <w:t>│</w:t>
+        <w:t xml:space="preserve">│   │   </w:t>
+      </w:r>
+      <w:r>
+        <w:rPr>
+          <w:rFonts w:ascii="Times New Roman" w:eastAsia="MS Gothic" w:hAnsi="Times New Roman" w:cs="Times New Roman"/>
+          <w:color w:val="000000" w:themeColor="text1"/>
+          <w:sz w:val="20"/>
+          <w:szCs w:val="20"/>
+        </w:rPr>
+        <w:t>├</w:t>
+      </w:r>
+      <w:r>
+        <w:rPr>
+          <w:rFonts w:ascii="Times New Roman" w:eastAsia="Calibri" w:hAnsi="Times New Roman" w:cs="Times New Roman"/>
+          <w:color w:val="000000" w:themeColor="text1"/>
+          <w:sz w:val="20"/>
+          <w:szCs w:val="20"/>
+        </w:rPr>
+        <w:t xml:space="preserve">── Milestone 1/ </w:t>
       </w:r>
     </w:p>
     <w:p>
@@ -13568,21 +13396,30 @@
       </w:pPr>
       <w:r>
         <w:rPr>
-          <w:rFonts w:ascii="Times New Roman" w:eastAsia="MS Gothic" w:hAnsi="Times New Roman" w:cs="Times New Roman"/>
+          <w:rFonts w:ascii="Times New Roman" w:eastAsia="Calibri" w:hAnsi="Times New Roman" w:cs="Times New Roman"/>
           <w:color w:val="000000" w:themeColor="text1"/>
           <w:sz w:val="20"/>
           <w:szCs w:val="20"/>
         </w:rPr>
-        <w:t>├</w:t>
-      </w:r>
-      <w:r>
-        <w:rPr>
-          <w:rFonts w:ascii="Times New Roman" w:eastAsia="Calibri" w:hAnsi="Times New Roman" w:cs="Times New Roman"/>
+        <w:t xml:space="preserve">│   │   </w:t>
+      </w:r>
+      <w:r>
+        <w:rPr>
+          <w:rFonts w:ascii="Times New Roman" w:eastAsia="MS Gothic" w:hAnsi="Times New Roman" w:cs="Times New Roman"/>
           <w:color w:val="000000" w:themeColor="text1"/>
           <w:sz w:val="20"/>
           <w:szCs w:val="20"/>
         </w:rPr>
-        <w:t xml:space="preserve">── Shiny-App/                            </w:t>
+        <w:t>├</w:t>
+      </w:r>
+      <w:r>
+        <w:rPr>
+          <w:rFonts w:ascii="Times New Roman" w:eastAsia="Calibri" w:hAnsi="Times New Roman" w:cs="Times New Roman"/>
+          <w:color w:val="000000" w:themeColor="text1"/>
+          <w:sz w:val="20"/>
+          <w:szCs w:val="20"/>
+        </w:rPr>
+        <w:t>── Milestone 2/</w:t>
       </w:r>
     </w:p>
     <w:p>
@@ -13598,21 +13435,30 @@
       </w:pPr>
       <w:r>
         <w:rPr>
-          <w:rFonts w:ascii="Times New Roman" w:eastAsia="MS Gothic" w:hAnsi="Times New Roman" w:cs="Times New Roman"/>
+          <w:rFonts w:ascii="Times New Roman" w:eastAsia="Calibri" w:hAnsi="Times New Roman" w:cs="Times New Roman"/>
           <w:color w:val="000000" w:themeColor="text1"/>
           <w:sz w:val="20"/>
           <w:szCs w:val="20"/>
         </w:rPr>
-        <w:t>├</w:t>
-      </w:r>
-      <w:r>
-        <w:rPr>
-          <w:rFonts w:ascii="Times New Roman" w:eastAsia="Calibri" w:hAnsi="Times New Roman" w:cs="Times New Roman"/>
+        <w:t xml:space="preserve">│   │   </w:t>
+      </w:r>
+      <w:r>
+        <w:rPr>
+          <w:rFonts w:ascii="Times New Roman" w:eastAsia="MS Gothic" w:hAnsi="Times New Roman" w:cs="Times New Roman"/>
           <w:color w:val="000000" w:themeColor="text1"/>
           <w:sz w:val="20"/>
           <w:szCs w:val="20"/>
         </w:rPr>
-        <w:t xml:space="preserve">── Models/                            </w:t>
+        <w:t>├</w:t>
+      </w:r>
+      <w:r>
+        <w:rPr>
+          <w:rFonts w:ascii="Times New Roman" w:eastAsia="Calibri" w:hAnsi="Times New Roman" w:cs="Times New Roman"/>
+          <w:color w:val="000000" w:themeColor="text1"/>
+          <w:sz w:val="20"/>
+          <w:szCs w:val="20"/>
+        </w:rPr>
+        <w:t>── Milestone 3/</w:t>
       </w:r>
     </w:p>
     <w:p>
@@ -13628,21 +13474,33 @@
       </w:pPr>
       <w:r>
         <w:rPr>
-          <w:rFonts w:ascii="Times New Roman" w:eastAsia="MS Gothic" w:hAnsi="Times New Roman" w:cs="Times New Roman"/>
+          <w:rFonts w:ascii="Times New Roman" w:eastAsia="Calibri" w:hAnsi="Times New Roman" w:cs="Times New Roman"/>
           <w:color w:val="000000" w:themeColor="text1"/>
           <w:sz w:val="20"/>
           <w:szCs w:val="20"/>
         </w:rPr>
-        <w:t>├</w:t>
-      </w:r>
-      <w:r>
+        <w:t xml:space="preserve">│   │   └── Project Outline/           </w:t>
+      </w:r>
+    </w:p>
+    <w:p>
+      <w:pPr>
+        <w:keepNext/>
+        <w:spacing w:before="60" w:after="60" w:line="240" w:lineRule="auto"/>
         <w:rPr>
           <w:rFonts w:ascii="Times New Roman" w:eastAsia="Calibri" w:hAnsi="Times New Roman" w:cs="Times New Roman"/>
           <w:color w:val="000000" w:themeColor="text1"/>
           <w:sz w:val="20"/>
           <w:szCs w:val="20"/>
         </w:rPr>
-        <w:t>── Datasets/</w:t>
+      </w:pPr>
+      <w:r>
+        <w:rPr>
+          <w:rFonts w:ascii="Times New Roman" w:eastAsia="Calibri" w:hAnsi="Times New Roman" w:cs="Times New Roman"/>
+          <w:color w:val="000000" w:themeColor="text1"/>
+          <w:sz w:val="20"/>
+          <w:szCs w:val="20"/>
+        </w:rPr>
+        <w:t xml:space="preserve">│   └── Rendered Documentation/  </w:t>
       </w:r>
     </w:p>
     <w:p>
@@ -13663,17 +13521,20 @@
           <w:sz w:val="20"/>
           <w:szCs w:val="20"/>
         </w:rPr>
-        <w:t xml:space="preserve">│   </w:t>
-      </w:r>
-      <w:r>
-        <w:rPr>
-          <w:rFonts w:ascii="Times New Roman" w:eastAsia="MS Gothic" w:hAnsi="Times New Roman" w:cs="Times New Roman"/>
+        <w:t xml:space="preserve">│                                       </w:t>
+      </w:r>
+    </w:p>
+    <w:p>
+      <w:pPr>
+        <w:keepNext/>
+        <w:spacing w:before="60" w:after="60" w:line="240" w:lineRule="auto"/>
+        <w:rPr>
+          <w:rFonts w:ascii="Times New Roman" w:eastAsia="Calibri" w:hAnsi="Times New Roman" w:cs="Times New Roman"/>
           <w:color w:val="000000" w:themeColor="text1"/>
           <w:sz w:val="20"/>
           <w:szCs w:val="20"/>
         </w:rPr>
-        <w:t>├</w:t>
-      </w:r>
+      </w:pPr>
       <w:r>
         <w:rPr>
           <w:rFonts w:ascii="Times New Roman" w:eastAsia="Calibri" w:hAnsi="Times New Roman" w:cs="Times New Roman"/>
@@ -13681,7 +13542,7 @@
           <w:sz w:val="20"/>
           <w:szCs w:val="20"/>
         </w:rPr>
-        <w:t xml:space="preserve">── D01_…csv – D11_…csv               </w:t>
+        <w:t>└── Power Bi/</w:t>
       </w:r>
     </w:p>
     <w:p>
@@ -13702,7 +13563,7 @@
           <w:sz w:val="20"/>
           <w:szCs w:val="20"/>
         </w:rPr>
-        <w:t xml:space="preserve">│   </w:t>
+        <w:t xml:space="preserve">    </w:t>
       </w:r>
       <w:r>
         <w:rPr>
@@ -13720,7 +13581,7 @@
           <w:sz w:val="20"/>
           <w:szCs w:val="20"/>
         </w:rPr>
-        <w:t xml:space="preserve">── Cleaned/                               </w:t>
+        <w:t xml:space="preserve">── Final Power Bi.pbix            </w:t>
       </w:r>
     </w:p>
     <w:p>
@@ -13741,7 +13602,25 @@
           <w:sz w:val="20"/>
           <w:szCs w:val="20"/>
         </w:rPr>
-        <w:t xml:space="preserve">│   └─ Analytical/                      </w:t>
+        <w:t xml:space="preserve">    </w:t>
+      </w:r>
+      <w:r>
+        <w:rPr>
+          <w:rFonts w:ascii="Times New Roman" w:eastAsia="MS Gothic" w:hAnsi="Times New Roman" w:cs="Times New Roman"/>
+          <w:color w:val="000000" w:themeColor="text1"/>
+          <w:sz w:val="20"/>
+          <w:szCs w:val="20"/>
+        </w:rPr>
+        <w:t>├</w:t>
+      </w:r>
+      <w:r>
+        <w:rPr>
+          <w:rFonts w:ascii="Times New Roman" w:eastAsia="Calibri" w:hAnsi="Times New Roman" w:cs="Times New Roman"/>
+          <w:color w:val="000000" w:themeColor="text1"/>
+          <w:sz w:val="20"/>
+          <w:szCs w:val="20"/>
+        </w:rPr>
+        <w:t xml:space="preserve">── BIN381_Theme.json               </w:t>
       </w:r>
     </w:p>
     <w:p>
@@ -13762,13 +13641,29 @@
           <w:sz w:val="20"/>
           <w:szCs w:val="20"/>
         </w:rPr>
-        <w:t>│</w:t>
+        <w:t xml:space="preserve">    </w:t>
+      </w:r>
+      <w:r>
+        <w:rPr>
+          <w:rFonts w:ascii="Times New Roman" w:eastAsia="MS Gothic" w:hAnsi="Times New Roman" w:cs="Times New Roman"/>
+          <w:color w:val="000000" w:themeColor="text1"/>
+          <w:sz w:val="20"/>
+          <w:szCs w:val="20"/>
+        </w:rPr>
+        <w:t>├</w:t>
+      </w:r>
+      <w:r>
+        <w:rPr>
+          <w:rFonts w:ascii="Times New Roman" w:eastAsia="Calibri" w:hAnsi="Times New Roman" w:cs="Times New Roman"/>
+          <w:color w:val="000000" w:themeColor="text1"/>
+          <w:sz w:val="20"/>
+          <w:szCs w:val="20"/>
+        </w:rPr>
+        <w:t xml:space="preserve">── Initial Power Bi.pbix           </w:t>
       </w:r>
     </w:p>
     <w:p>
       <w:pPr>
-        <w:keepNext/>
-        <w:spacing w:before="60" w:after="60" w:line="240" w:lineRule="auto"/>
         <w:rPr>
           <w:rFonts w:ascii="Times New Roman" w:eastAsia="Calibri" w:hAnsi="Times New Roman" w:cs="Times New Roman"/>
           <w:color w:val="000000" w:themeColor="text1"/>
@@ -13778,449 +13673,13 @@
       </w:pPr>
       <w:r>
         <w:rPr>
-          <w:rFonts w:ascii="Times New Roman" w:eastAsia="MS Gothic" w:hAnsi="Times New Roman" w:cs="Times New Roman"/>
+          <w:rFonts w:ascii="Times New Roman" w:eastAsia="Calibri" w:hAnsi="Times New Roman" w:cs="Times New Roman"/>
           <w:color w:val="000000" w:themeColor="text1"/>
           <w:sz w:val="20"/>
           <w:szCs w:val="20"/>
         </w:rPr>
-        <w:t>├</w:t>
-      </w:r>
-      <w:r>
-        <w:rPr>
-          <w:rFonts w:ascii="Times New Roman" w:eastAsia="Calibri" w:hAnsi="Times New Roman" w:cs="Times New Roman"/>
-          <w:color w:val="000000" w:themeColor="text1"/>
-          <w:sz w:val="20"/>
-          <w:szCs w:val="20"/>
-        </w:rPr>
-        <w:t>── Documentation/</w:t>
-      </w:r>
-    </w:p>
-    <w:p>
-      <w:pPr>
-        <w:keepNext/>
-        <w:spacing w:before="60" w:after="60" w:line="240" w:lineRule="auto"/>
-        <w:rPr>
-          <w:rFonts w:ascii="Times New Roman" w:eastAsia="Calibri" w:hAnsi="Times New Roman" w:cs="Times New Roman"/>
-          <w:color w:val="000000" w:themeColor="text1"/>
-          <w:sz w:val="20"/>
-          <w:szCs w:val="20"/>
-        </w:rPr>
-      </w:pPr>
-      <w:r>
-        <w:rPr>
-          <w:rFonts w:ascii="Times New Roman" w:eastAsia="Calibri" w:hAnsi="Times New Roman" w:cs="Times New Roman"/>
-          <w:color w:val="000000" w:themeColor="text1"/>
-          <w:sz w:val="20"/>
-          <w:szCs w:val="20"/>
-        </w:rPr>
-        <w:t xml:space="preserve">│   </w:t>
-      </w:r>
-      <w:r>
-        <w:rPr>
-          <w:rFonts w:ascii="Times New Roman" w:eastAsia="MS Gothic" w:hAnsi="Times New Roman" w:cs="Times New Roman"/>
-          <w:color w:val="000000" w:themeColor="text1"/>
-          <w:sz w:val="20"/>
-          <w:szCs w:val="20"/>
-        </w:rPr>
-        <w:t>├</w:t>
-      </w:r>
-      <w:r>
-        <w:rPr>
-          <w:rFonts w:ascii="Times New Roman" w:eastAsia="Calibri" w:hAnsi="Times New Roman" w:cs="Times New Roman"/>
-          <w:color w:val="000000" w:themeColor="text1"/>
-          <w:sz w:val="20"/>
-          <w:szCs w:val="20"/>
-        </w:rPr>
-        <w:t>── Milestone Documentation/</w:t>
-      </w:r>
-    </w:p>
-    <w:p>
-      <w:pPr>
-        <w:keepNext/>
-        <w:spacing w:before="60" w:after="60" w:line="240" w:lineRule="auto"/>
-        <w:rPr>
-          <w:rFonts w:ascii="Times New Roman" w:eastAsia="Calibri" w:hAnsi="Times New Roman" w:cs="Times New Roman"/>
-          <w:color w:val="000000" w:themeColor="text1"/>
-          <w:sz w:val="20"/>
-          <w:szCs w:val="20"/>
-        </w:rPr>
-      </w:pPr>
-      <w:r>
-        <w:rPr>
-          <w:rFonts w:ascii="Times New Roman" w:eastAsia="Calibri" w:hAnsi="Times New Roman" w:cs="Times New Roman"/>
-          <w:color w:val="000000" w:themeColor="text1"/>
-          <w:sz w:val="20"/>
-          <w:szCs w:val="20"/>
-        </w:rPr>
-        <w:t xml:space="preserve">│   │   </w:t>
-      </w:r>
-      <w:r>
-        <w:rPr>
-          <w:rFonts w:ascii="Times New Roman" w:eastAsia="MS Gothic" w:hAnsi="Times New Roman" w:cs="Times New Roman"/>
-          <w:color w:val="000000" w:themeColor="text1"/>
-          <w:sz w:val="20"/>
-          <w:szCs w:val="20"/>
-        </w:rPr>
-        <w:t>├</w:t>
-      </w:r>
-      <w:r>
-        <w:rPr>
-          <w:rFonts w:ascii="Times New Roman" w:eastAsia="Calibri" w:hAnsi="Times New Roman" w:cs="Times New Roman"/>
-          <w:color w:val="000000" w:themeColor="text1"/>
-          <w:sz w:val="20"/>
-          <w:szCs w:val="20"/>
-        </w:rPr>
-        <w:t xml:space="preserve">── Milestone 1/ </w:t>
-      </w:r>
-    </w:p>
-    <w:p>
-      <w:pPr>
-        <w:keepNext/>
-        <w:spacing w:before="60" w:after="60" w:line="240" w:lineRule="auto"/>
-        <w:rPr>
-          <w:rFonts w:ascii="Times New Roman" w:eastAsia="Calibri" w:hAnsi="Times New Roman" w:cs="Times New Roman"/>
-          <w:color w:val="000000" w:themeColor="text1"/>
-          <w:sz w:val="20"/>
-          <w:szCs w:val="20"/>
-        </w:rPr>
-      </w:pPr>
-      <w:r>
-        <w:rPr>
-          <w:rFonts w:ascii="Times New Roman" w:eastAsia="Calibri" w:hAnsi="Times New Roman" w:cs="Times New Roman"/>
-          <w:color w:val="000000" w:themeColor="text1"/>
-          <w:sz w:val="20"/>
-          <w:szCs w:val="20"/>
-        </w:rPr>
-        <w:t xml:space="preserve">│   │   </w:t>
-      </w:r>
-      <w:r>
-        <w:rPr>
-          <w:rFonts w:ascii="Times New Roman" w:eastAsia="MS Gothic" w:hAnsi="Times New Roman" w:cs="Times New Roman"/>
-          <w:color w:val="000000" w:themeColor="text1"/>
-          <w:sz w:val="20"/>
-          <w:szCs w:val="20"/>
-        </w:rPr>
-        <w:t>├</w:t>
-      </w:r>
-      <w:r>
-        <w:rPr>
-          <w:rFonts w:ascii="Times New Roman" w:eastAsia="Calibri" w:hAnsi="Times New Roman" w:cs="Times New Roman"/>
-          <w:color w:val="000000" w:themeColor="text1"/>
-          <w:sz w:val="20"/>
-          <w:szCs w:val="20"/>
-        </w:rPr>
-        <w:t>── Milestone 2/</w:t>
-      </w:r>
-    </w:p>
-    <w:p>
-      <w:pPr>
-        <w:keepNext/>
-        <w:spacing w:before="60" w:after="60" w:line="240" w:lineRule="auto"/>
-        <w:rPr>
-          <w:rFonts w:ascii="Times New Roman" w:eastAsia="Calibri" w:hAnsi="Times New Roman" w:cs="Times New Roman"/>
-          <w:color w:val="000000" w:themeColor="text1"/>
-          <w:sz w:val="20"/>
-          <w:szCs w:val="20"/>
-        </w:rPr>
-      </w:pPr>
-      <w:r>
-        <w:rPr>
-          <w:rFonts w:ascii="Times New Roman" w:eastAsia="Calibri" w:hAnsi="Times New Roman" w:cs="Times New Roman"/>
-          <w:color w:val="000000" w:themeColor="text1"/>
-          <w:sz w:val="20"/>
-          <w:szCs w:val="20"/>
-        </w:rPr>
-        <w:t xml:space="preserve">│   │   </w:t>
-      </w:r>
-      <w:r>
-        <w:rPr>
-          <w:rFonts w:ascii="Times New Roman" w:eastAsia="MS Gothic" w:hAnsi="Times New Roman" w:cs="Times New Roman"/>
-          <w:color w:val="000000" w:themeColor="text1"/>
-          <w:sz w:val="20"/>
-          <w:szCs w:val="20"/>
-        </w:rPr>
-        <w:t>├</w:t>
-      </w:r>
-      <w:r>
-        <w:rPr>
-          <w:rFonts w:ascii="Times New Roman" w:eastAsia="Calibri" w:hAnsi="Times New Roman" w:cs="Times New Roman"/>
-          <w:color w:val="000000" w:themeColor="text1"/>
-          <w:sz w:val="20"/>
-          <w:szCs w:val="20"/>
-        </w:rPr>
-        <w:t>── Milestone 3/</w:t>
-      </w:r>
-    </w:p>
-    <w:p>
-      <w:pPr>
-        <w:keepNext/>
-        <w:spacing w:before="60" w:after="60" w:line="240" w:lineRule="auto"/>
-        <w:rPr>
-          <w:rFonts w:ascii="Times New Roman" w:eastAsia="Calibri" w:hAnsi="Times New Roman" w:cs="Times New Roman"/>
-          <w:color w:val="000000" w:themeColor="text1"/>
-          <w:sz w:val="20"/>
-          <w:szCs w:val="20"/>
-        </w:rPr>
-      </w:pPr>
-      <w:r>
-        <w:rPr>
-          <w:rFonts w:ascii="Times New Roman" w:eastAsia="Calibri" w:hAnsi="Times New Roman" w:cs="Times New Roman"/>
-          <w:color w:val="000000" w:themeColor="text1"/>
-          <w:sz w:val="20"/>
-          <w:szCs w:val="20"/>
-        </w:rPr>
-        <w:t xml:space="preserve">│   │   └── Project Outline/           </w:t>
-      </w:r>
-    </w:p>
-    <w:p>
-      <w:pPr>
-        <w:keepNext/>
-        <w:spacing w:before="60" w:after="60" w:line="240" w:lineRule="auto"/>
-        <w:rPr>
-          <w:rFonts w:ascii="Times New Roman" w:eastAsia="Calibri" w:hAnsi="Times New Roman" w:cs="Times New Roman"/>
-          <w:color w:val="000000" w:themeColor="text1"/>
-          <w:sz w:val="20"/>
-          <w:szCs w:val="20"/>
-        </w:rPr>
-      </w:pPr>
-      <w:r>
-        <w:rPr>
-          <w:rFonts w:ascii="Times New Roman" w:eastAsia="Calibri" w:hAnsi="Times New Roman" w:cs="Times New Roman"/>
-          <w:color w:val="000000" w:themeColor="text1"/>
-          <w:sz w:val="20"/>
-          <w:szCs w:val="20"/>
-        </w:rPr>
-        <w:t xml:space="preserve">│   └── Rendered Documentation/  </w:t>
-      </w:r>
-    </w:p>
-    <w:p>
-      <w:pPr>
-        <w:keepNext/>
-        <w:spacing w:before="60" w:after="60" w:line="240" w:lineRule="auto"/>
-        <w:rPr>
-          <w:rFonts w:ascii="Times New Roman" w:eastAsia="Calibri" w:hAnsi="Times New Roman" w:cs="Times New Roman"/>
-          <w:color w:val="000000" w:themeColor="text1"/>
-          <w:sz w:val="20"/>
-          <w:szCs w:val="20"/>
-        </w:rPr>
-      </w:pPr>
-      <w:r>
-        <w:rPr>
-          <w:rFonts w:ascii="Times New Roman" w:eastAsia="Calibri" w:hAnsi="Times New Roman" w:cs="Times New Roman"/>
-          <w:color w:val="000000" w:themeColor="text1"/>
-          <w:sz w:val="20"/>
-          <w:szCs w:val="20"/>
-        </w:rPr>
-        <w:t xml:space="preserve">│                                       </w:t>
-      </w:r>
-    </w:p>
-    <w:p>
-      <w:pPr>
-        <w:keepNext/>
-        <w:spacing w:before="60" w:after="60" w:line="240" w:lineRule="auto"/>
-        <w:rPr>
-          <w:rFonts w:ascii="Times New Roman" w:eastAsia="Calibri" w:hAnsi="Times New Roman" w:cs="Times New Roman"/>
-          <w:color w:val="000000" w:themeColor="text1"/>
-          <w:sz w:val="20"/>
-          <w:szCs w:val="20"/>
-        </w:rPr>
-      </w:pPr>
-      <w:r>
-        <w:rPr>
-          <w:rFonts w:ascii="Times New Roman" w:eastAsia="Calibri" w:hAnsi="Times New Roman" w:cs="Times New Roman"/>
-          <w:color w:val="000000" w:themeColor="text1"/>
-          <w:sz w:val="20"/>
-          <w:szCs w:val="20"/>
-        </w:rPr>
-        <w:t>└── Power Bi/</w:t>
-      </w:r>
-    </w:p>
-    <w:p>
-      <w:pPr>
-        <w:keepNext/>
-        <w:spacing w:before="60" w:after="60" w:line="240" w:lineRule="auto"/>
-        <w:rPr>
-          <w:rFonts w:ascii="Times New Roman" w:eastAsia="Calibri" w:hAnsi="Times New Roman" w:cs="Times New Roman"/>
-          <w:color w:val="000000" w:themeColor="text1"/>
-          <w:sz w:val="20"/>
-          <w:szCs w:val="20"/>
-        </w:rPr>
-      </w:pPr>
-      <w:r>
-        <w:rPr>
-          <w:rFonts w:ascii="Times New Roman" w:eastAsia="Calibri" w:hAnsi="Times New Roman" w:cs="Times New Roman"/>
-          <w:color w:val="000000" w:themeColor="text1"/>
-          <w:sz w:val="20"/>
-          <w:szCs w:val="20"/>
-        </w:rPr>
-        <w:t xml:space="preserve">    </w:t>
-      </w:r>
-      <w:r>
-        <w:rPr>
-          <w:rFonts w:ascii="Times New Roman" w:eastAsia="MS Gothic" w:hAnsi="Times New Roman" w:cs="Times New Roman"/>
-          <w:color w:val="000000" w:themeColor="text1"/>
-          <w:sz w:val="20"/>
-          <w:szCs w:val="20"/>
-        </w:rPr>
-        <w:t>├</w:t>
-      </w:r>
-      <w:r>
-        <w:rPr>
-          <w:rFonts w:ascii="Times New Roman" w:eastAsia="Calibri" w:hAnsi="Times New Roman" w:cs="Times New Roman"/>
-          <w:color w:val="000000" w:themeColor="text1"/>
-          <w:sz w:val="20"/>
-          <w:szCs w:val="20"/>
-        </w:rPr>
-        <w:t xml:space="preserve">── Final Power </w:t>
-      </w:r>
-      <w:proofErr w:type="spellStart"/>
-      <w:r>
-        <w:rPr>
-          <w:rFonts w:ascii="Times New Roman" w:eastAsia="Calibri" w:hAnsi="Times New Roman" w:cs="Times New Roman"/>
-          <w:color w:val="000000" w:themeColor="text1"/>
-          <w:sz w:val="20"/>
-          <w:szCs w:val="20"/>
-        </w:rPr>
-        <w:t>Bi.pbix</w:t>
-      </w:r>
-      <w:proofErr w:type="spellEnd"/>
-      <w:r>
-        <w:rPr>
-          <w:rFonts w:ascii="Times New Roman" w:eastAsia="Calibri" w:hAnsi="Times New Roman" w:cs="Times New Roman"/>
-          <w:color w:val="000000" w:themeColor="text1"/>
-          <w:sz w:val="20"/>
-          <w:szCs w:val="20"/>
-        </w:rPr>
-        <w:t xml:space="preserve">            </w:t>
-      </w:r>
-    </w:p>
-    <w:p>
-      <w:pPr>
-        <w:keepNext/>
-        <w:spacing w:before="60" w:after="60" w:line="240" w:lineRule="auto"/>
-        <w:rPr>
-          <w:rFonts w:ascii="Times New Roman" w:eastAsia="Calibri" w:hAnsi="Times New Roman" w:cs="Times New Roman"/>
-          <w:color w:val="000000" w:themeColor="text1"/>
-          <w:sz w:val="20"/>
-          <w:szCs w:val="20"/>
-        </w:rPr>
-      </w:pPr>
-      <w:r>
-        <w:rPr>
-          <w:rFonts w:ascii="Times New Roman" w:eastAsia="Calibri" w:hAnsi="Times New Roman" w:cs="Times New Roman"/>
-          <w:color w:val="000000" w:themeColor="text1"/>
-          <w:sz w:val="20"/>
-          <w:szCs w:val="20"/>
-        </w:rPr>
-        <w:t xml:space="preserve">    </w:t>
-      </w:r>
-      <w:r>
-        <w:rPr>
-          <w:rFonts w:ascii="Times New Roman" w:eastAsia="MS Gothic" w:hAnsi="Times New Roman" w:cs="Times New Roman"/>
-          <w:color w:val="000000" w:themeColor="text1"/>
-          <w:sz w:val="20"/>
-          <w:szCs w:val="20"/>
-        </w:rPr>
-        <w:t>├</w:t>
-      </w:r>
-      <w:r>
-        <w:rPr>
-          <w:rFonts w:ascii="Times New Roman" w:eastAsia="Calibri" w:hAnsi="Times New Roman" w:cs="Times New Roman"/>
-          <w:color w:val="000000" w:themeColor="text1"/>
-          <w:sz w:val="20"/>
-          <w:szCs w:val="20"/>
-        </w:rPr>
-        <w:t xml:space="preserve">── BIN381_Theme.json               </w:t>
-      </w:r>
-    </w:p>
-    <w:p>
-      <w:pPr>
-        <w:keepNext/>
-        <w:spacing w:before="60" w:after="60" w:line="240" w:lineRule="auto"/>
-        <w:rPr>
-          <w:rFonts w:ascii="Times New Roman" w:eastAsia="Calibri" w:hAnsi="Times New Roman" w:cs="Times New Roman"/>
-          <w:color w:val="000000" w:themeColor="text1"/>
-          <w:sz w:val="20"/>
-          <w:szCs w:val="20"/>
-        </w:rPr>
-      </w:pPr>
-      <w:r>
-        <w:rPr>
-          <w:rFonts w:ascii="Times New Roman" w:eastAsia="Calibri" w:hAnsi="Times New Roman" w:cs="Times New Roman"/>
-          <w:color w:val="000000" w:themeColor="text1"/>
-          <w:sz w:val="20"/>
-          <w:szCs w:val="20"/>
-        </w:rPr>
-        <w:t xml:space="preserve">    </w:t>
-      </w:r>
-      <w:r>
-        <w:rPr>
-          <w:rFonts w:ascii="Times New Roman" w:eastAsia="MS Gothic" w:hAnsi="Times New Roman" w:cs="Times New Roman"/>
-          <w:color w:val="000000" w:themeColor="text1"/>
-          <w:sz w:val="20"/>
-          <w:szCs w:val="20"/>
-        </w:rPr>
-        <w:t>├</w:t>
-      </w:r>
-      <w:r>
-        <w:rPr>
-          <w:rFonts w:ascii="Times New Roman" w:eastAsia="Calibri" w:hAnsi="Times New Roman" w:cs="Times New Roman"/>
-          <w:color w:val="000000" w:themeColor="text1"/>
-          <w:sz w:val="20"/>
-          <w:szCs w:val="20"/>
-        </w:rPr>
-        <w:t xml:space="preserve">── Initial Power </w:t>
-      </w:r>
-      <w:proofErr w:type="spellStart"/>
-      <w:r>
-        <w:rPr>
-          <w:rFonts w:ascii="Times New Roman" w:eastAsia="Calibri" w:hAnsi="Times New Roman" w:cs="Times New Roman"/>
-          <w:color w:val="000000" w:themeColor="text1"/>
-          <w:sz w:val="20"/>
-          <w:szCs w:val="20"/>
-        </w:rPr>
-        <w:t>Bi.pbix</w:t>
-      </w:r>
-      <w:proofErr w:type="spellEnd"/>
-      <w:r>
-        <w:rPr>
-          <w:rFonts w:ascii="Times New Roman" w:eastAsia="Calibri" w:hAnsi="Times New Roman" w:cs="Times New Roman"/>
-          <w:color w:val="000000" w:themeColor="text1"/>
-          <w:sz w:val="20"/>
-          <w:szCs w:val="20"/>
-        </w:rPr>
-        <w:t xml:space="preserve">           </w:t>
-      </w:r>
-    </w:p>
-    <w:p>
-      <w:pPr>
-        <w:rPr>
-          <w:rFonts w:ascii="Times New Roman" w:eastAsia="Calibri" w:hAnsi="Times New Roman" w:cs="Times New Roman"/>
-          <w:color w:val="000000" w:themeColor="text1"/>
-          <w:sz w:val="20"/>
-          <w:szCs w:val="20"/>
-        </w:rPr>
-      </w:pPr>
-      <w:r>
-        <w:rPr>
-          <w:rFonts w:ascii="Times New Roman" w:eastAsia="Calibri" w:hAnsi="Times New Roman" w:cs="Times New Roman"/>
-          <w:color w:val="000000" w:themeColor="text1"/>
-          <w:sz w:val="20"/>
-          <w:szCs w:val="20"/>
-        </w:rPr>
-        <w:t xml:space="preserve">    └── Dashboard_*_</w:t>
-      </w:r>
-      <w:proofErr w:type="spellStart"/>
-      <w:r>
-        <w:rPr>
-          <w:rFonts w:ascii="Times New Roman" w:eastAsia="Calibri" w:hAnsi="Times New Roman" w:cs="Times New Roman"/>
-          <w:color w:val="000000" w:themeColor="text1"/>
-          <w:sz w:val="20"/>
-          <w:szCs w:val="20"/>
-        </w:rPr>
-        <w:t>Theme.json</w:t>
-      </w:r>
-      <w:proofErr w:type="spellEnd"/>
+        <w:t xml:space="preserve">    └── Dashboard_*_Theme.json</w:t>
+      </w:r>
     </w:p>
     <w:p>
       <w:pPr>
@@ -14340,160 +13799,12 @@
           <w:szCs w:val="22"/>
         </w:rPr>
       </w:pPr>
-      <w:proofErr w:type="spellStart"/>
-      <w:proofErr w:type="gramStart"/>
       <w:r>
         <w:rPr>
           <w:rFonts w:ascii="Times New Roman" w:hAnsi="Times New Roman" w:cs="Times New Roman"/>
           <w:sz w:val="22"/>
         </w:rPr>
-        <w:t>install.packages</w:t>
-      </w:r>
-      <w:proofErr w:type="spellEnd"/>
-      <w:proofErr w:type="gramEnd"/>
-      <w:r>
-        <w:rPr>
-          <w:rFonts w:ascii="Times New Roman" w:hAnsi="Times New Roman" w:cs="Times New Roman"/>
-          <w:sz w:val="22"/>
-        </w:rPr>
-        <w:t>(</w:t>
-      </w:r>
-      <w:proofErr w:type="gramStart"/>
-      <w:r>
-        <w:rPr>
-          <w:rFonts w:ascii="Times New Roman" w:hAnsi="Times New Roman" w:cs="Times New Roman"/>
-          <w:sz w:val="22"/>
-        </w:rPr>
-        <w:t>c(</w:t>
-      </w:r>
-      <w:proofErr w:type="gramEnd"/>
-      <w:r>
-        <w:rPr>
-          <w:rFonts w:ascii="Times New Roman" w:hAnsi="Times New Roman" w:cs="Times New Roman"/>
-          <w:sz w:val="22"/>
-        </w:rPr>
-        <w:t>"</w:t>
-      </w:r>
-      <w:proofErr w:type="spellStart"/>
-      <w:r>
-        <w:rPr>
-          <w:rFonts w:ascii="Times New Roman" w:hAnsi="Times New Roman" w:cs="Times New Roman"/>
-          <w:sz w:val="22"/>
-        </w:rPr>
-        <w:t>tidyverse</w:t>
-      </w:r>
-      <w:proofErr w:type="spellEnd"/>
-      <w:r>
-        <w:rPr>
-          <w:rFonts w:ascii="Times New Roman" w:hAnsi="Times New Roman" w:cs="Times New Roman"/>
-          <w:sz w:val="22"/>
-        </w:rPr>
-        <w:t>", "janitor", "</w:t>
-      </w:r>
-      <w:proofErr w:type="spellStart"/>
-      <w:r>
-        <w:rPr>
-          <w:rFonts w:ascii="Times New Roman" w:hAnsi="Times New Roman" w:cs="Times New Roman"/>
-          <w:sz w:val="22"/>
-        </w:rPr>
-        <w:t>skimr</w:t>
-      </w:r>
-      <w:proofErr w:type="spellEnd"/>
-      <w:r>
-        <w:rPr>
-          <w:rFonts w:ascii="Times New Roman" w:hAnsi="Times New Roman" w:cs="Times New Roman"/>
-          <w:sz w:val="22"/>
-        </w:rPr>
-        <w:t>", "</w:t>
-      </w:r>
-      <w:proofErr w:type="spellStart"/>
-      <w:r>
-        <w:rPr>
-          <w:rFonts w:ascii="Times New Roman" w:hAnsi="Times New Roman" w:cs="Times New Roman"/>
-          <w:sz w:val="22"/>
-        </w:rPr>
-        <w:t>visdat</w:t>
-      </w:r>
-      <w:proofErr w:type="spellEnd"/>
-      <w:r>
-        <w:rPr>
-          <w:rFonts w:ascii="Times New Roman" w:hAnsi="Times New Roman" w:cs="Times New Roman"/>
-          <w:sz w:val="22"/>
-        </w:rPr>
-        <w:t>", "survey", "</w:t>
-      </w:r>
-      <w:proofErr w:type="spellStart"/>
-      <w:r>
-        <w:rPr>
-          <w:rFonts w:ascii="Times New Roman" w:hAnsi="Times New Roman" w:cs="Times New Roman"/>
-          <w:sz w:val="22"/>
-        </w:rPr>
-        <w:t>rpart</w:t>
-      </w:r>
-      <w:proofErr w:type="spellEnd"/>
-      <w:r>
-        <w:rPr>
-          <w:rFonts w:ascii="Times New Roman" w:hAnsi="Times New Roman" w:cs="Times New Roman"/>
-          <w:sz w:val="22"/>
-        </w:rPr>
-        <w:t>", "</w:t>
-      </w:r>
-      <w:proofErr w:type="spellStart"/>
-      <w:proofErr w:type="gramStart"/>
-      <w:r>
-        <w:rPr>
-          <w:rFonts w:ascii="Times New Roman" w:hAnsi="Times New Roman" w:cs="Times New Roman"/>
-          <w:sz w:val="22"/>
-        </w:rPr>
-        <w:t>rpart.plot</w:t>
-      </w:r>
-      <w:proofErr w:type="gramEnd"/>
-      <w:r>
-        <w:rPr>
-          <w:rFonts w:ascii="Times New Roman" w:hAnsi="Times New Roman" w:cs="Times New Roman"/>
-          <w:sz w:val="22"/>
-        </w:rPr>
-        <w:t>","ranger</w:t>
-      </w:r>
-      <w:proofErr w:type="spellEnd"/>
-      <w:r>
-        <w:rPr>
-          <w:rFonts w:ascii="Times New Roman" w:hAnsi="Times New Roman" w:cs="Times New Roman"/>
-          <w:sz w:val="22"/>
-        </w:rPr>
-        <w:t>", "</w:t>
-      </w:r>
-      <w:proofErr w:type="spellStart"/>
-      <w:r>
-        <w:rPr>
-          <w:rFonts w:ascii="Times New Roman" w:hAnsi="Times New Roman" w:cs="Times New Roman"/>
-          <w:sz w:val="22"/>
-        </w:rPr>
-        <w:t>pROC</w:t>
-      </w:r>
-      <w:proofErr w:type="spellEnd"/>
-      <w:r>
-        <w:rPr>
-          <w:rFonts w:ascii="Times New Roman" w:hAnsi="Times New Roman" w:cs="Times New Roman"/>
-          <w:sz w:val="22"/>
-        </w:rPr>
-        <w:t>", "caret", "shiny", "</w:t>
-      </w:r>
-      <w:proofErr w:type="spellStart"/>
-      <w:r>
-        <w:rPr>
-          <w:rFonts w:ascii="Times New Roman" w:hAnsi="Times New Roman" w:cs="Times New Roman"/>
-          <w:sz w:val="22"/>
-        </w:rPr>
-        <w:t>bslib</w:t>
-      </w:r>
-      <w:proofErr w:type="spellEnd"/>
-      <w:r>
-        <w:rPr>
-          <w:rFonts w:ascii="Times New Roman" w:hAnsi="Times New Roman" w:cs="Times New Roman"/>
-          <w:sz w:val="22"/>
-        </w:rPr>
-        <w:t>"))</w:t>
+        <w:t>install.packages(c("tidyverse", "janitor", "skimr", "visdat", "survey", "rpart", "rpart.plot","ranger", "pROC", "caret", "shiny", "bslib"))</w:t>
       </w:r>
     </w:p>
     <w:p>
@@ -14624,25 +13935,7 @@
           <w:sz w:val="22"/>
           <w:szCs w:val="22"/>
         </w:rPr>
-        <w:t xml:space="preserve">Run the notebooks in this order. Each one reads files written by earlier steps, so a notebook can be rerun on its own once its inputs exist. 1) </w:t>
-      </w:r>
-      <w:proofErr w:type="spellStart"/>
-      <w:r>
-        <w:rPr>
-          <w:rFonts w:ascii="Times New Roman" w:hAnsi="Times New Roman" w:cs="Times New Roman"/>
-          <w:sz w:val="22"/>
-          <w:szCs w:val="22"/>
-        </w:rPr>
-        <w:t>EDA.qmd</w:t>
-      </w:r>
-      <w:proofErr w:type="spellEnd"/>
-      <w:r>
-        <w:rPr>
-          <w:rFonts w:ascii="Times New Roman" w:hAnsi="Times New Roman" w:cs="Times New Roman"/>
-          <w:sz w:val="22"/>
-          <w:szCs w:val="22"/>
-        </w:rPr>
-        <w:t xml:space="preserve"> is the Milestone 1 exploration</w:t>
+        <w:t>Run the notebooks in this order. Each one reads files written by earlier steps, so a notebook can be rerun on its own once its inputs exist. 1) EDA.qmd is the Milestone 1 exploration</w:t>
       </w:r>
       <w:r>
         <w:rPr>
@@ -14862,19 +14155,8 @@
                 <w:lang w:val="en-ZA"/>
                 <w14:ligatures w14:val="standardContextual"/>
               </w:rPr>
-              <w:t xml:space="preserve">2.1) Data </w:t>
-            </w:r>
-            <w:proofErr w:type="spellStart"/>
-            <w:r>
-              <w:rPr>
-                <w:rFonts w:ascii="Times New Roman" w:eastAsiaTheme="minorEastAsia" w:hAnsi="Times New Roman" w:cs="Times New Roman"/>
-                <w:kern w:val="2"/>
-                <w:lang w:val="en-ZA"/>
-                <w14:ligatures w14:val="standardContextual"/>
-              </w:rPr>
-              <w:t>Preprocessing.qmd</w:t>
-            </w:r>
-            <w:proofErr w:type="spellEnd"/>
+              <w:t>2.1) Data Preprocessing.qmd</w:t>
+            </w:r>
           </w:p>
         </w:tc>
         <w:tc>
@@ -15059,19 +14341,8 @@
                 <w:lang w:val="en-ZA"/>
                 <w14:ligatures w14:val="standardContextual"/>
               </w:rPr>
-              <w:t xml:space="preserve">2.2) Train-Test </w:t>
-            </w:r>
-            <w:proofErr w:type="spellStart"/>
-            <w:r>
-              <w:rPr>
-                <w:rFonts w:ascii="Times New Roman" w:eastAsiaTheme="minorEastAsia" w:hAnsi="Times New Roman" w:cs="Times New Roman"/>
-                <w:kern w:val="2"/>
-                <w:lang w:val="en-ZA"/>
-                <w14:ligatures w14:val="standardContextual"/>
-              </w:rPr>
-              <w:t>Split.qmd</w:t>
-            </w:r>
-            <w:proofErr w:type="spellEnd"/>
+              <w:t>2.2) Train-Test Split.qmd</w:t>
+            </w:r>
           </w:p>
         </w:tc>
         <w:tc>
@@ -15255,19 +14526,8 @@
                 <w:lang w:val="en-ZA"/>
                 <w14:ligatures w14:val="standardContextual"/>
               </w:rPr>
-              <w:t xml:space="preserve">3.1) Employment </w:t>
-            </w:r>
-            <w:proofErr w:type="spellStart"/>
-            <w:r>
-              <w:rPr>
-                <w:rFonts w:ascii="Times New Roman" w:eastAsiaTheme="minorEastAsia" w:hAnsi="Times New Roman" w:cs="Times New Roman"/>
-                <w:kern w:val="2"/>
-                <w:lang w:val="en-ZA"/>
-                <w14:ligatures w14:val="standardContextual"/>
-              </w:rPr>
-              <w:t>Model.qmd</w:t>
-            </w:r>
-            <w:proofErr w:type="spellEnd"/>
+              <w:t>3.1) Employment Model.qmd</w:t>
+            </w:r>
           </w:p>
         </w:tc>
         <w:tc>
@@ -15308,7 +14568,6 @@
                 <w14:ligatures w14:val="standardContextual"/>
               </w:rPr>
             </w:pPr>
-            <w:proofErr w:type="spellStart"/>
             <w:r>
               <w:rPr>
                 <w:rFonts w:ascii="Times New Roman" w:eastAsiaTheme="minorEastAsia" w:hAnsi="Times New Roman" w:cs="Times New Roman"/>
@@ -15317,7 +14576,6 @@
               </w:rPr>
               <w:t>employment_logistic.rds</w:t>
             </w:r>
-            <w:proofErr w:type="spellEnd"/>
             <w:r>
               <w:rPr>
                 <w:rFonts w:ascii="Times New Roman" w:eastAsiaTheme="minorEastAsia" w:hAnsi="Times New Roman" w:cs="Times New Roman"/>
@@ -15327,7 +14585,6 @@
               </w:rPr>
               <w:t xml:space="preserve">, </w:t>
             </w:r>
-            <w:proofErr w:type="spellStart"/>
             <w:r>
               <w:rPr>
                 <w:rFonts w:ascii="Times New Roman" w:eastAsiaTheme="minorEastAsia" w:hAnsi="Times New Roman" w:cs="Times New Roman"/>
@@ -15336,7 +14593,6 @@
               </w:rPr>
               <w:t>employment_tree.rds</w:t>
             </w:r>
-            <w:proofErr w:type="spellEnd"/>
             <w:r>
               <w:rPr>
                 <w:rFonts w:ascii="Times New Roman" w:eastAsiaTheme="minorEastAsia" w:hAnsi="Times New Roman" w:cs="Times New Roman"/>
@@ -15346,7 +14602,6 @@
               </w:rPr>
               <w:t xml:space="preserve">, </w:t>
             </w:r>
-            <w:proofErr w:type="spellStart"/>
             <w:r>
               <w:rPr>
                 <w:rFonts w:ascii="Times New Roman" w:eastAsiaTheme="minorEastAsia" w:hAnsi="Times New Roman" w:cs="Times New Roman"/>
@@ -15355,7 +14610,6 @@
               </w:rPr>
               <w:t>employment_forest.rds</w:t>
             </w:r>
-            <w:proofErr w:type="spellEnd"/>
             <w:r>
               <w:rPr>
                 <w:rFonts w:ascii="Times New Roman" w:eastAsiaTheme="minorEastAsia" w:hAnsi="Times New Roman" w:cs="Times New Roman"/>
@@ -15423,19 +14677,8 @@
                 <w:lang w:val="en-ZA"/>
                 <w14:ligatures w14:val="standardContextual"/>
               </w:rPr>
-              <w:t xml:space="preserve">3.2) Income </w:t>
-            </w:r>
-            <w:proofErr w:type="spellStart"/>
-            <w:r>
-              <w:rPr>
-                <w:rFonts w:ascii="Times New Roman" w:eastAsiaTheme="minorEastAsia" w:hAnsi="Times New Roman" w:cs="Times New Roman"/>
-                <w:kern w:val="2"/>
-                <w:lang w:val="en-ZA"/>
-                <w14:ligatures w14:val="standardContextual"/>
-              </w:rPr>
-              <w:t>Model.qmd</w:t>
-            </w:r>
-            <w:proofErr w:type="spellEnd"/>
+              <w:t>3.2) Income Model.qmd</w:t>
+            </w:r>
           </w:p>
         </w:tc>
         <w:tc>
@@ -15476,7 +14719,6 @@
                 <w14:ligatures w14:val="standardContextual"/>
               </w:rPr>
             </w:pPr>
-            <w:proofErr w:type="spellStart"/>
             <w:r>
               <w:rPr>
                 <w:rFonts w:ascii="Times New Roman" w:eastAsiaTheme="minorEastAsia" w:hAnsi="Times New Roman" w:cs="Times New Roman"/>
@@ -15485,7 +14727,6 @@
               </w:rPr>
               <w:t>income_linear.rds</w:t>
             </w:r>
-            <w:proofErr w:type="spellEnd"/>
             <w:r>
               <w:rPr>
                 <w:rFonts w:ascii="Times New Roman" w:eastAsiaTheme="minorEastAsia" w:hAnsi="Times New Roman" w:cs="Times New Roman"/>
@@ -15495,7 +14736,6 @@
               </w:rPr>
               <w:t xml:space="preserve">, </w:t>
             </w:r>
-            <w:proofErr w:type="spellStart"/>
             <w:r>
               <w:rPr>
                 <w:rFonts w:ascii="Times New Roman" w:eastAsiaTheme="minorEastAsia" w:hAnsi="Times New Roman" w:cs="Times New Roman"/>
@@ -15504,7 +14744,6 @@
               </w:rPr>
               <w:t>income_forest.rds</w:t>
             </w:r>
-            <w:proofErr w:type="spellEnd"/>
             <w:r>
               <w:rPr>
                 <w:rFonts w:ascii="Times New Roman" w:eastAsiaTheme="minorEastAsia" w:hAnsi="Times New Roman" w:cs="Times New Roman"/>
@@ -15572,45 +14811,33 @@
                 <w:lang w:val="en-ZA"/>
                 <w14:ligatures w14:val="standardContextual"/>
               </w:rPr>
-              <w:t xml:space="preserve">3.3) Model </w:t>
-            </w:r>
-            <w:proofErr w:type="spellStart"/>
-            <w:r>
+              <w:t>3.3) Model Evaluation.qmd</w:t>
+            </w:r>
+          </w:p>
+        </w:tc>
+        <w:tc>
+          <w:tcPr>
+            <w:tcW w:w="2340" w:type="dxa"/>
+          </w:tcPr>
+          <w:p>
+            <w:pPr>
+              <w:spacing w:line="278" w:lineRule="auto"/>
               <w:rPr>
                 <w:rFonts w:ascii="Times New Roman" w:eastAsiaTheme="minorEastAsia" w:hAnsi="Times New Roman" w:cs="Times New Roman"/>
                 <w:kern w:val="2"/>
                 <w:lang w:val="en-ZA"/>
                 <w14:ligatures w14:val="standardContextual"/>
               </w:rPr>
-              <w:t>Evaluation.qmd</w:t>
-            </w:r>
-            <w:proofErr w:type="spellEnd"/>
-          </w:p>
-        </w:tc>
-        <w:tc>
-          <w:tcPr>
-            <w:tcW w:w="2340" w:type="dxa"/>
-          </w:tcPr>
-          <w:p>
-            <w:pPr>
-              <w:spacing w:line="278" w:lineRule="auto"/>
+            </w:pPr>
+            <w:r>
               <w:rPr>
                 <w:rFonts w:ascii="Times New Roman" w:eastAsiaTheme="minorEastAsia" w:hAnsi="Times New Roman" w:cs="Times New Roman"/>
                 <w:kern w:val="2"/>
                 <w:lang w:val="en-ZA"/>
                 <w14:ligatures w14:val="standardContextual"/>
               </w:rPr>
-            </w:pPr>
-            <w:r>
-              <w:rPr>
-                <w:rFonts w:ascii="Times New Roman" w:eastAsiaTheme="minorEastAsia" w:hAnsi="Times New Roman" w:cs="Times New Roman"/>
-                <w:kern w:val="2"/>
-                <w:lang w:val="en-ZA"/>
-                <w14:ligatures w14:val="standardContextual"/>
-              </w:rPr>
               <w:t xml:space="preserve">Train and test files; </w:t>
             </w:r>
-            <w:proofErr w:type="spellStart"/>
             <w:r>
               <w:rPr>
                 <w:rFonts w:ascii="Times New Roman" w:eastAsiaTheme="minorEastAsia" w:hAnsi="Times New Roman" w:cs="Times New Roman"/>
@@ -15619,7 +14846,6 @@
               </w:rPr>
               <w:t>employment_logistic.rds</w:t>
             </w:r>
-            <w:proofErr w:type="spellEnd"/>
             <w:r>
               <w:rPr>
                 <w:rFonts w:ascii="Times New Roman" w:eastAsiaTheme="minorEastAsia" w:hAnsi="Times New Roman" w:cs="Times New Roman"/>
@@ -15629,7 +14855,6 @@
               </w:rPr>
               <w:t xml:space="preserve">, </w:t>
             </w:r>
-            <w:proofErr w:type="spellStart"/>
             <w:r>
               <w:rPr>
                 <w:rFonts w:ascii="Times New Roman" w:eastAsiaTheme="minorEastAsia" w:hAnsi="Times New Roman" w:cs="Times New Roman"/>
@@ -15638,7 +14863,6 @@
               </w:rPr>
               <w:t>income_linear.rds</w:t>
             </w:r>
-            <w:proofErr w:type="spellEnd"/>
           </w:p>
         </w:tc>
         <w:tc>
@@ -15739,19 +14963,8 @@
                 <w:lang w:val="en-ZA"/>
                 <w14:ligatures w14:val="standardContextual"/>
               </w:rPr>
-              <w:t xml:space="preserve">3.4) Deployment </w:t>
-            </w:r>
-            <w:proofErr w:type="spellStart"/>
-            <w:r>
-              <w:rPr>
-                <w:rFonts w:ascii="Times New Roman" w:eastAsiaTheme="minorEastAsia" w:hAnsi="Times New Roman" w:cs="Times New Roman"/>
-                <w:kern w:val="2"/>
-                <w:lang w:val="en-ZA"/>
-                <w14:ligatures w14:val="standardContextual"/>
-              </w:rPr>
-              <w:t>Preparation.qmd</w:t>
-            </w:r>
-            <w:proofErr w:type="spellEnd"/>
+              <w:t>3.4) Deployment Preparation.qmd</w:t>
+            </w:r>
           </w:p>
         </w:tc>
         <w:tc>
@@ -15807,18 +15020,8 @@
                 <w:kern w:val="2"/>
                 <w14:ligatures w14:val="standardContextual"/>
               </w:rPr>
-              <w:t>Shiny-App/</w:t>
-            </w:r>
-            <w:proofErr w:type="spellStart"/>
-            <w:r>
-              <w:rPr>
-                <w:rFonts w:ascii="Times New Roman" w:eastAsiaTheme="minorEastAsia" w:hAnsi="Times New Roman" w:cs="Times New Roman"/>
-                <w:kern w:val="2"/>
-                <w14:ligatures w14:val="standardContextual"/>
-              </w:rPr>
-              <w:t>app_data.rds</w:t>
-            </w:r>
-            <w:proofErr w:type="spellEnd"/>
+              <w:t>Shiny-App/app_data.rds</w:t>
+            </w:r>
           </w:p>
         </w:tc>
       </w:tr>
@@ -15848,25 +15051,7 @@
           <w:sz w:val="22"/>
           <w:szCs w:val="22"/>
         </w:rPr>
-        <w:t>Every random step uses seed 67, so reruns produce identical files and models. Rendering a notebook (the Render button in RStudio, or quarto render in the Scripts folder) saves the output in Documentation/Rendered Documentation/; Scripts/_</w:t>
-      </w:r>
-      <w:proofErr w:type="spellStart"/>
-      <w:r>
-        <w:rPr>
-          <w:rFonts w:ascii="Times New Roman" w:hAnsi="Times New Roman" w:cs="Times New Roman"/>
-          <w:sz w:val="22"/>
-          <w:szCs w:val="22"/>
-        </w:rPr>
-        <w:t>quarto.yml</w:t>
-      </w:r>
-      <w:proofErr w:type="spellEnd"/>
-      <w:r>
-        <w:rPr>
-          <w:rFonts w:ascii="Times New Roman" w:hAnsi="Times New Roman" w:cs="Times New Roman"/>
-          <w:sz w:val="22"/>
-          <w:szCs w:val="22"/>
-        </w:rPr>
-        <w:t xml:space="preserve"> sets this</w:t>
+        <w:t>Every random step uses seed 67, so reruns produce identical files and models. Rendering a notebook (the Render button in RStudio, or quarto render in the Scripts folder) saves the output in Documentation/Rendered Documentation/; Scripts/_quarto.yml sets this</w:t>
       </w:r>
       <w:r>
         <w:rPr>
@@ -15931,9 +15116,8 @@
           <w:sz w:val="22"/>
           <w:szCs w:val="22"/>
         </w:rPr>
-        <w:t>run shiny::</w:t>
-      </w:r>
-      <w:proofErr w:type="spellStart"/>
+        <w:t>run shiny::runApp("Shiny-App")</w:t>
+      </w:r>
       <w:r>
         <w:rPr>
           <w:rFonts w:ascii="Times New Roman" w:hAnsi="Times New Roman" w:cs="Times New Roman"/>
@@ -15941,9 +15125,8 @@
           <w:sz w:val="22"/>
           <w:szCs w:val="22"/>
         </w:rPr>
-        <w:t>runApp</w:t>
-      </w:r>
-      <w:proofErr w:type="spellEnd"/>
+        <w:t>. The app loads only</w:t>
+      </w:r>
       <w:r>
         <w:rPr>
           <w:rFonts w:ascii="Times New Roman" w:hAnsi="Times New Roman" w:cs="Times New Roman"/>
@@ -15951,37 +15134,8 @@
           <w:sz w:val="22"/>
           <w:szCs w:val="22"/>
         </w:rPr>
-        <w:t>("Shiny-App")</w:t>
-      </w:r>
-      <w:r>
-        <w:rPr>
-          <w:rFonts w:ascii="Times New Roman" w:hAnsi="Times New Roman" w:cs="Times New Roman"/>
-          <w:color w:val="000000" w:themeColor="text1"/>
-          <w:sz w:val="22"/>
-          <w:szCs w:val="22"/>
-        </w:rPr>
-        <w:t>. The app loads only</w:t>
-      </w:r>
-      <w:r>
-        <w:rPr>
-          <w:rFonts w:ascii="Times New Roman" w:hAnsi="Times New Roman" w:cs="Times New Roman"/>
-          <w:color w:val="000000" w:themeColor="text1"/>
-          <w:sz w:val="22"/>
-          <w:szCs w:val="22"/>
-        </w:rPr>
-        <w:t xml:space="preserve"> </w:t>
-      </w:r>
-      <w:proofErr w:type="spellStart"/>
-      <w:r>
-        <w:rPr>
-          <w:rFonts w:ascii="Times New Roman" w:hAnsi="Times New Roman" w:cs="Times New Roman"/>
-          <w:color w:val="000000" w:themeColor="text1"/>
-          <w:sz w:val="22"/>
-          <w:szCs w:val="22"/>
-        </w:rPr>
-        <w:t>app_data.rds</w:t>
-      </w:r>
-      <w:proofErr w:type="spellEnd"/>
+        <w:t xml:space="preserve"> app_data.rds</w:t>
+      </w:r>
       <w:r>
         <w:rPr>
           <w:rFonts w:ascii="Times New Roman" w:hAnsi="Times New Roman" w:cs="Times New Roman"/>
@@ -16300,7 +15454,6 @@
                 <w:rFonts w:ascii="Times New Roman" w:hAnsi="Times New Roman" w:cs="Times New Roman"/>
               </w:rPr>
             </w:pPr>
-            <w:proofErr w:type="spellStart"/>
             <w:r>
               <w:rPr>
                 <w:rStyle w:val="CodeChar"/>
@@ -16308,7 +15461,6 @@
               </w:rPr>
               <w:t>app_data.rds</w:t>
             </w:r>
-            <w:proofErr w:type="spellEnd"/>
             <w:r>
               <w:rPr>
                 <w:rFonts w:ascii="Times New Roman" w:hAnsi="Times New Roman" w:cs="Times New Roman"/>
@@ -17303,6 +16455,29 @@
       </w:tr>
     </w:tbl>
     <w:p/>
+    <w:p>
+      <w:pPr>
+        <w:pStyle w:val="Heading2"/>
+        <w:numPr>
+          <w:ilvl w:val="0"/>
+          <w:numId w:val="25"/>
+        </w:numPr>
+        <w:rPr>
+          <w:color w:val="000000" w:themeColor="text1"/>
+        </w:rPr>
+      </w:pPr>
+      <w:r>
+        <w:rPr>
+          <w:color w:val="000000" w:themeColor="text1"/>
+        </w:rPr>
+        <w:t>AI Usage Log</w:t>
+      </w:r>
+    </w:p>
+    <w:p>
+      <w:r>
+        <w:t>For this project, we used Claude, if we struggled to interpret any values we got from models, or needed any help with writing code Claude was used. We also used Claude to help write the documents, since it has a better vocabulary and is better at structuring sentences then us. It also helped us with a colour scheme for the power bi, and helped us pick models. After Claude produced work for us we would read through it make sure everything it was saying was correct and that it worked.</w:t>
+      </w:r>
+    </w:p>
     <w:sectPr>
       <w:footerReference w:type="default" r:id="rId10"/>
       <w:pgSz w:w="11906" w:h="16838"/>
@@ -19880,15 +19055,6 @@
   </w:num>
   <w:num w:numId="19" w16cid:durableId="1088766827">
     <w:abstractNumId w:val="18"/>
-    <w:lvlOverride w:ilvl="0"/>
-    <w:lvlOverride w:ilvl="1"/>
-    <w:lvlOverride w:ilvl="2"/>
-    <w:lvlOverride w:ilvl="3"/>
-    <w:lvlOverride w:ilvl="4"/>
-    <w:lvlOverride w:ilvl="5"/>
-    <w:lvlOverride w:ilvl="6"/>
-    <w:lvlOverride w:ilvl="7"/>
-    <w:lvlOverride w:ilvl="8"/>
   </w:num>
   <w:num w:numId="20" w16cid:durableId="1924483617">
     <w:abstractNumId w:val="17"/>

</xml_diff>

<commit_message>
Final touch ups on documents
</commit_message>
<xml_diff>
--- a/Documentation/Milestone Documentation/Milestone 4/Milestone 4 Final Report Submit.docx
+++ b/Documentation/Milestone Documentation/Milestone 4/Milestone 4 Final Report Submit.docx
@@ -772,12 +772,14 @@
             <w:pStyle w:val="TOCHeading"/>
             <w:rPr>
               <w:rFonts w:ascii="Times New Roman" w:hAnsi="Times New Roman" w:cs="Times New Roman"/>
+              <w:color w:val="auto"/>
               <w:lang w:val="en-ZA"/>
             </w:rPr>
           </w:pPr>
           <w:r>
             <w:rPr>
               <w:rFonts w:ascii="Times New Roman" w:hAnsi="Times New Roman" w:cs="Times New Roman"/>
+              <w:color w:val="auto"/>
               <w:lang w:val="en-ZA"/>
             </w:rPr>
             <w:t>Table of Contents</w:t>
@@ -812,7 +814,7 @@
             </w:rPr>
             <w:fldChar w:fldCharType="separate"/>
           </w:r>
-          <w:hyperlink w:anchor="_Toc243237429" w:history="1">
+          <w:hyperlink w:anchor="_Toc243321398" w:history="1">
             <w:r>
               <w:rPr>
                 <w:rStyle w:val="Hyperlink"/>
@@ -840,7 +842,7 @@
                 <w:noProof/>
                 <w:webHidden/>
               </w:rPr>
-              <w:instrText xml:space="preserve"> PAGEREF _Toc243237429 \h </w:instrText>
+              <w:instrText xml:space="preserve"> PAGEREF _Toc243321398 \h </w:instrText>
             </w:r>
             <w:r>
               <w:rPr>
@@ -883,7 +885,7 @@
               <w:lang w:eastAsia="en-ZA"/>
             </w:rPr>
           </w:pPr>
-          <w:hyperlink w:anchor="_Toc243237430" w:history="1">
+          <w:hyperlink w:anchor="_Toc243321399" w:history="1">
             <w:r>
               <w:rPr>
                 <w:rStyle w:val="Hyperlink"/>
@@ -926,7 +928,7 @@
                 <w:noProof/>
                 <w:webHidden/>
               </w:rPr>
-              <w:instrText xml:space="preserve"> PAGEREF _Toc243237430 \h </w:instrText>
+              <w:instrText xml:space="preserve"> PAGEREF _Toc243321399 \h </w:instrText>
             </w:r>
             <w:r>
               <w:rPr>
@@ -969,7 +971,7 @@
               <w:lang w:eastAsia="en-ZA"/>
             </w:rPr>
           </w:pPr>
-          <w:hyperlink w:anchor="_Toc243237431" w:history="1">
+          <w:hyperlink w:anchor="_Toc243321400" w:history="1">
             <w:r>
               <w:rPr>
                 <w:rStyle w:val="Hyperlink"/>
@@ -1012,7 +1014,7 @@
                 <w:noProof/>
                 <w:webHidden/>
               </w:rPr>
-              <w:instrText xml:space="preserve"> PAGEREF _Toc243237431 \h </w:instrText>
+              <w:instrText xml:space="preserve"> PAGEREF _Toc243321400 \h </w:instrText>
             </w:r>
             <w:r>
               <w:rPr>
@@ -1055,7 +1057,7 @@
               <w:lang w:eastAsia="en-ZA"/>
             </w:rPr>
           </w:pPr>
-          <w:hyperlink w:anchor="_Toc243237432" w:history="1">
+          <w:hyperlink w:anchor="_Toc243321401" w:history="1">
             <w:r>
               <w:rPr>
                 <w:rStyle w:val="Hyperlink"/>
@@ -1098,7 +1100,7 @@
                 <w:noProof/>
                 <w:webHidden/>
               </w:rPr>
-              <w:instrText xml:space="preserve"> PAGEREF _Toc243237432 \h </w:instrText>
+              <w:instrText xml:space="preserve"> PAGEREF _Toc243321401 \h </w:instrText>
             </w:r>
             <w:r>
               <w:rPr>
@@ -1141,7 +1143,7 @@
               <w:lang w:eastAsia="en-ZA"/>
             </w:rPr>
           </w:pPr>
-          <w:hyperlink w:anchor="_Toc243237433" w:history="1">
+          <w:hyperlink w:anchor="_Toc243321402" w:history="1">
             <w:r>
               <w:rPr>
                 <w:rStyle w:val="Hyperlink"/>
@@ -1184,7 +1186,7 @@
                 <w:noProof/>
                 <w:webHidden/>
               </w:rPr>
-              <w:instrText xml:space="preserve"> PAGEREF _Toc243237433 \h </w:instrText>
+              <w:instrText xml:space="preserve"> PAGEREF _Toc243321402 \h </w:instrText>
             </w:r>
             <w:r>
               <w:rPr>
@@ -1227,7 +1229,7 @@
               <w:lang w:eastAsia="en-ZA"/>
             </w:rPr>
           </w:pPr>
-          <w:hyperlink w:anchor="_Toc243237434" w:history="1">
+          <w:hyperlink w:anchor="_Toc243321403" w:history="1">
             <w:r>
               <w:rPr>
                 <w:rStyle w:val="Hyperlink"/>
@@ -1270,7 +1272,7 @@
                 <w:noProof/>
                 <w:webHidden/>
               </w:rPr>
-              <w:instrText xml:space="preserve"> PAGEREF _Toc243237434 \h </w:instrText>
+              <w:instrText xml:space="preserve"> PAGEREF _Toc243321403 \h </w:instrText>
             </w:r>
             <w:r>
               <w:rPr>
@@ -1313,7 +1315,7 @@
               <w:lang w:eastAsia="en-ZA"/>
             </w:rPr>
           </w:pPr>
-          <w:hyperlink w:anchor="_Toc243237435" w:history="1">
+          <w:hyperlink w:anchor="_Toc243321404" w:history="1">
             <w:r>
               <w:rPr>
                 <w:rStyle w:val="Hyperlink"/>
@@ -1356,7 +1358,7 @@
                 <w:noProof/>
                 <w:webHidden/>
               </w:rPr>
-              <w:instrText xml:space="preserve"> PAGEREF _Toc243237435 \h </w:instrText>
+              <w:instrText xml:space="preserve"> PAGEREF _Toc243321404 \h </w:instrText>
             </w:r>
             <w:r>
               <w:rPr>
@@ -1399,7 +1401,7 @@
               <w:lang w:eastAsia="en-ZA"/>
             </w:rPr>
           </w:pPr>
-          <w:hyperlink w:anchor="_Toc243237436" w:history="1">
+          <w:hyperlink w:anchor="_Toc243321405" w:history="1">
             <w:r>
               <w:rPr>
                 <w:rStyle w:val="Hyperlink"/>
@@ -1442,7 +1444,7 @@
                 <w:noProof/>
                 <w:webHidden/>
               </w:rPr>
-              <w:instrText xml:space="preserve"> PAGEREF _Toc243237436 \h </w:instrText>
+              <w:instrText xml:space="preserve"> PAGEREF _Toc243321405 \h </w:instrText>
             </w:r>
             <w:r>
               <w:rPr>
@@ -1485,7 +1487,7 @@
               <w:lang w:eastAsia="en-ZA"/>
             </w:rPr>
           </w:pPr>
-          <w:hyperlink w:anchor="_Toc243237437" w:history="1">
+          <w:hyperlink w:anchor="_Toc243321406" w:history="1">
             <w:r>
               <w:rPr>
                 <w:rStyle w:val="Hyperlink"/>
@@ -1528,7 +1530,7 @@
                 <w:noProof/>
                 <w:webHidden/>
               </w:rPr>
-              <w:instrText xml:space="preserve"> PAGEREF _Toc243237437 \h </w:instrText>
+              <w:instrText xml:space="preserve"> PAGEREF _Toc243321406 \h </w:instrText>
             </w:r>
             <w:r>
               <w:rPr>
@@ -1571,7 +1573,7 @@
               <w:lang w:eastAsia="en-ZA"/>
             </w:rPr>
           </w:pPr>
-          <w:hyperlink w:anchor="_Toc243237438" w:history="1">
+          <w:hyperlink w:anchor="_Toc243321407" w:history="1">
             <w:r>
               <w:rPr>
                 <w:rStyle w:val="Hyperlink"/>
@@ -1614,7 +1616,7 @@
                 <w:noProof/>
                 <w:webHidden/>
               </w:rPr>
-              <w:instrText xml:space="preserve"> PAGEREF _Toc243237438 \h </w:instrText>
+              <w:instrText xml:space="preserve"> PAGEREF _Toc243321407 \h </w:instrText>
             </w:r>
             <w:r>
               <w:rPr>
@@ -1657,7 +1659,7 @@
               <w:lang w:eastAsia="en-ZA"/>
             </w:rPr>
           </w:pPr>
-          <w:hyperlink w:anchor="_Toc243237439" w:history="1">
+          <w:hyperlink w:anchor="_Toc243321408" w:history="1">
             <w:r>
               <w:rPr>
                 <w:rStyle w:val="Hyperlink"/>
@@ -1700,7 +1702,7 @@
                 <w:noProof/>
                 <w:webHidden/>
               </w:rPr>
-              <w:instrText xml:space="preserve"> PAGEREF _Toc243237439 \h </w:instrText>
+              <w:instrText xml:space="preserve"> PAGEREF _Toc243321408 \h </w:instrText>
             </w:r>
             <w:r>
               <w:rPr>
@@ -1743,7 +1745,7 @@
               <w:lang w:eastAsia="en-ZA"/>
             </w:rPr>
           </w:pPr>
-          <w:hyperlink w:anchor="_Toc243237440" w:history="1">
+          <w:hyperlink w:anchor="_Toc243321409" w:history="1">
             <w:r>
               <w:rPr>
                 <w:rStyle w:val="Hyperlink"/>
@@ -1786,7 +1788,7 @@
                 <w:noProof/>
                 <w:webHidden/>
               </w:rPr>
-              <w:instrText xml:space="preserve"> PAGEREF _Toc243237440 \h </w:instrText>
+              <w:instrText xml:space="preserve"> PAGEREF _Toc243321409 \h </w:instrText>
             </w:r>
             <w:r>
               <w:rPr>
@@ -1829,7 +1831,7 @@
               <w:lang w:eastAsia="en-ZA"/>
             </w:rPr>
           </w:pPr>
-          <w:hyperlink w:anchor="_Toc243237441" w:history="1">
+          <w:hyperlink w:anchor="_Toc243321410" w:history="1">
             <w:r>
               <w:rPr>
                 <w:rStyle w:val="Hyperlink"/>
@@ -1872,7 +1874,7 @@
                 <w:noProof/>
                 <w:webHidden/>
               </w:rPr>
-              <w:instrText xml:space="preserve"> PAGEREF _Toc243237441 \h </w:instrText>
+              <w:instrText xml:space="preserve"> PAGEREF _Toc243321410 \h </w:instrText>
             </w:r>
             <w:r>
               <w:rPr>
@@ -1915,7 +1917,7 @@
               <w:lang w:eastAsia="en-ZA"/>
             </w:rPr>
           </w:pPr>
-          <w:hyperlink w:anchor="_Toc243237442" w:history="1">
+          <w:hyperlink w:anchor="_Toc243321411" w:history="1">
             <w:r>
               <w:rPr>
                 <w:rStyle w:val="Hyperlink"/>
@@ -1958,7 +1960,7 @@
                 <w:noProof/>
                 <w:webHidden/>
               </w:rPr>
-              <w:instrText xml:space="preserve"> PAGEREF _Toc243237442 \h </w:instrText>
+              <w:instrText xml:space="preserve"> PAGEREF _Toc243321411 \h </w:instrText>
             </w:r>
             <w:r>
               <w:rPr>
@@ -2001,7 +2003,7 @@
               <w:lang w:eastAsia="en-ZA"/>
             </w:rPr>
           </w:pPr>
-          <w:hyperlink w:anchor="_Toc243237443" w:history="1">
+          <w:hyperlink w:anchor="_Toc243321412" w:history="1">
             <w:r>
               <w:rPr>
                 <w:rStyle w:val="Hyperlink"/>
@@ -2044,7 +2046,7 @@
                 <w:noProof/>
                 <w:webHidden/>
               </w:rPr>
-              <w:instrText xml:space="preserve"> PAGEREF _Toc243237443 \h </w:instrText>
+              <w:instrText xml:space="preserve"> PAGEREF _Toc243321412 \h </w:instrText>
             </w:r>
             <w:r>
               <w:rPr>
@@ -2086,7 +2088,7 @@
               <w:lang w:eastAsia="en-ZA"/>
             </w:rPr>
           </w:pPr>
-          <w:hyperlink w:anchor="_Toc243237444" w:history="1">
+          <w:hyperlink w:anchor="_Toc243321413" w:history="1">
             <w:r>
               <w:rPr>
                 <w:rStyle w:val="Hyperlink"/>
@@ -2114,7 +2116,7 @@
                 <w:noProof/>
                 <w:webHidden/>
               </w:rPr>
-              <w:instrText xml:space="preserve"> PAGEREF _Toc243237444 \h </w:instrText>
+              <w:instrText xml:space="preserve"> PAGEREF _Toc243321413 \h </w:instrText>
             </w:r>
             <w:r>
               <w:rPr>
@@ -2156,7 +2158,7 @@
               <w:lang w:eastAsia="en-ZA"/>
             </w:rPr>
           </w:pPr>
-          <w:hyperlink w:anchor="_Toc243237445" w:history="1">
+          <w:hyperlink w:anchor="_Toc243321414" w:history="1">
             <w:r>
               <w:rPr>
                 <w:rStyle w:val="Hyperlink"/>
@@ -2184,7 +2186,7 @@
                 <w:noProof/>
                 <w:webHidden/>
               </w:rPr>
-              <w:instrText xml:space="preserve"> PAGEREF _Toc243237445 \h </w:instrText>
+              <w:instrText xml:space="preserve"> PAGEREF _Toc243321414 \h </w:instrText>
             </w:r>
             <w:r>
               <w:rPr>
@@ -2227,7 +2229,7 @@
               <w:lang w:eastAsia="en-ZA"/>
             </w:rPr>
           </w:pPr>
-          <w:hyperlink w:anchor="_Toc243237446" w:history="1">
+          <w:hyperlink w:anchor="_Toc243321415" w:history="1">
             <w:r>
               <w:rPr>
                 <w:rStyle w:val="Hyperlink"/>
@@ -2270,7 +2272,7 @@
                 <w:noProof/>
                 <w:webHidden/>
               </w:rPr>
-              <w:instrText xml:space="preserve"> PAGEREF _Toc243237446 \h </w:instrText>
+              <w:instrText xml:space="preserve"> PAGEREF _Toc243321415 \h </w:instrText>
             </w:r>
             <w:r>
               <w:rPr>
@@ -2313,7 +2315,7 @@
               <w:lang w:eastAsia="en-ZA"/>
             </w:rPr>
           </w:pPr>
-          <w:hyperlink w:anchor="_Toc243237447" w:history="1">
+          <w:hyperlink w:anchor="_Toc243321416" w:history="1">
             <w:r>
               <w:rPr>
                 <w:rStyle w:val="Hyperlink"/>
@@ -2356,7 +2358,7 @@
                 <w:noProof/>
                 <w:webHidden/>
               </w:rPr>
-              <w:instrText xml:space="preserve"> PAGEREF _Toc243237447 \h </w:instrText>
+              <w:instrText xml:space="preserve"> PAGEREF _Toc243321416 \h </w:instrText>
             </w:r>
             <w:r>
               <w:rPr>
@@ -2399,7 +2401,7 @@
               <w:lang w:eastAsia="en-ZA"/>
             </w:rPr>
           </w:pPr>
-          <w:hyperlink w:anchor="_Toc243237448" w:history="1">
+          <w:hyperlink w:anchor="_Toc243321417" w:history="1">
             <w:r>
               <w:rPr>
                 <w:rStyle w:val="Hyperlink"/>
@@ -2442,7 +2444,7 @@
                 <w:noProof/>
                 <w:webHidden/>
               </w:rPr>
-              <w:instrText xml:space="preserve"> PAGEREF _Toc243237448 \h </w:instrText>
+              <w:instrText xml:space="preserve"> PAGEREF _Toc243321417 \h </w:instrText>
             </w:r>
             <w:r>
               <w:rPr>
@@ -2485,7 +2487,7 @@
               <w:lang w:eastAsia="en-ZA"/>
             </w:rPr>
           </w:pPr>
-          <w:hyperlink w:anchor="_Toc243237449" w:history="1">
+          <w:hyperlink w:anchor="_Toc243321418" w:history="1">
             <w:r>
               <w:rPr>
                 <w:rStyle w:val="Hyperlink"/>
@@ -2528,7 +2530,7 @@
                 <w:noProof/>
                 <w:webHidden/>
               </w:rPr>
-              <w:instrText xml:space="preserve"> PAGEREF _Toc243237449 \h </w:instrText>
+              <w:instrText xml:space="preserve"> PAGEREF _Toc243321418 \h </w:instrText>
             </w:r>
             <w:r>
               <w:rPr>
@@ -2571,7 +2573,7 @@
               <w:lang w:eastAsia="en-ZA"/>
             </w:rPr>
           </w:pPr>
-          <w:hyperlink w:anchor="_Toc243237450" w:history="1">
+          <w:hyperlink w:anchor="_Toc243321419" w:history="1">
             <w:r>
               <w:rPr>
                 <w:rStyle w:val="Hyperlink"/>
@@ -2614,7 +2616,7 @@
                 <w:noProof/>
                 <w:webHidden/>
               </w:rPr>
-              <w:instrText xml:space="preserve"> PAGEREF _Toc243237450 \h </w:instrText>
+              <w:instrText xml:space="preserve"> PAGEREF _Toc243321419 \h </w:instrText>
             </w:r>
             <w:r>
               <w:rPr>
@@ -2657,7 +2659,7 @@
               <w:lang w:eastAsia="en-ZA"/>
             </w:rPr>
           </w:pPr>
-          <w:hyperlink w:anchor="_Toc243237451" w:history="1">
+          <w:hyperlink w:anchor="_Toc243321420" w:history="1">
             <w:r>
               <w:rPr>
                 <w:rStyle w:val="Hyperlink"/>
@@ -2700,7 +2702,7 @@
                 <w:noProof/>
                 <w:webHidden/>
               </w:rPr>
-              <w:instrText xml:space="preserve"> PAGEREF _Toc243237451 \h </w:instrText>
+              <w:instrText xml:space="preserve"> PAGEREF _Toc243321420 \h </w:instrText>
             </w:r>
             <w:r>
               <w:rPr>
@@ -2743,7 +2745,7 @@
               <w:lang w:eastAsia="en-ZA"/>
             </w:rPr>
           </w:pPr>
-          <w:hyperlink w:anchor="_Toc243237452" w:history="1">
+          <w:hyperlink w:anchor="_Toc243321421" w:history="1">
             <w:r>
               <w:rPr>
                 <w:rStyle w:val="Hyperlink"/>
@@ -2786,7 +2788,7 @@
                 <w:noProof/>
                 <w:webHidden/>
               </w:rPr>
-              <w:instrText xml:space="preserve"> PAGEREF _Toc243237452 \h </w:instrText>
+              <w:instrText xml:space="preserve"> PAGEREF _Toc243321421 \h </w:instrText>
             </w:r>
             <w:r>
               <w:rPr>
@@ -2829,7 +2831,7 @@
               <w:lang w:eastAsia="en-ZA"/>
             </w:rPr>
           </w:pPr>
-          <w:hyperlink w:anchor="_Toc243237453" w:history="1">
+          <w:hyperlink w:anchor="_Toc243321422" w:history="1">
             <w:r>
               <w:rPr>
                 <w:rStyle w:val="Hyperlink"/>
@@ -2872,7 +2874,91 @@
                 <w:noProof/>
                 <w:webHidden/>
               </w:rPr>
-              <w:instrText xml:space="preserve"> PAGEREF _Toc243237453 \h </w:instrText>
+              <w:instrText xml:space="preserve"> PAGEREF _Toc243321422 \h </w:instrText>
+            </w:r>
+            <w:r>
+              <w:rPr>
+                <w:noProof/>
+                <w:webHidden/>
+              </w:rPr>
+            </w:r>
+            <w:r>
+              <w:rPr>
+                <w:noProof/>
+                <w:webHidden/>
+              </w:rPr>
+              <w:fldChar w:fldCharType="separate"/>
+            </w:r>
+            <w:r>
+              <w:rPr>
+                <w:noProof/>
+                <w:webHidden/>
+              </w:rPr>
+              <w:t>14</w:t>
+            </w:r>
+            <w:r>
+              <w:rPr>
+                <w:noProof/>
+                <w:webHidden/>
+              </w:rPr>
+              <w:fldChar w:fldCharType="end"/>
+            </w:r>
+          </w:hyperlink>
+        </w:p>
+        <w:p>
+          <w:pPr>
+            <w:pStyle w:val="TOC2"/>
+            <w:tabs>
+              <w:tab w:val="left" w:pos="720"/>
+              <w:tab w:val="right" w:leader="dot" w:pos="9016"/>
+            </w:tabs>
+            <w:rPr>
+              <w:noProof/>
+              <w:lang w:eastAsia="en-ZA"/>
+            </w:rPr>
+          </w:pPr>
+          <w:hyperlink w:anchor="_Toc243321423" w:history="1">
+            <w:r>
+              <w:rPr>
+                <w:rStyle w:val="Hyperlink"/>
+                <w:noProof/>
+              </w:rPr>
+              <w:t>D.</w:t>
+            </w:r>
+            <w:r>
+              <w:rPr>
+                <w:noProof/>
+                <w:lang w:eastAsia="en-ZA"/>
+              </w:rPr>
+              <w:tab/>
+            </w:r>
+            <w:r>
+              <w:rPr>
+                <w:rStyle w:val="Hyperlink"/>
+                <w:noProof/>
+              </w:rPr>
+              <w:t>AI Usage Log</w:t>
+            </w:r>
+            <w:r>
+              <w:rPr>
+                <w:noProof/>
+                <w:webHidden/>
+              </w:rPr>
+              <w:tab/>
+            </w:r>
+            <w:r>
+              <w:rPr>
+                <w:noProof/>
+                <w:webHidden/>
+              </w:rPr>
+              <w:fldChar w:fldCharType="begin"/>
+            </w:r>
+            <w:r>
+              <w:rPr>
+                <w:noProof/>
+                <w:webHidden/>
+              </w:rPr>
+              <w:instrText xml:space="preserve"> PAGEREF _Toc243321423 \h </w:instrText>
             </w:r>
             <w:r>
               <w:rPr>
@@ -2956,7 +3042,7 @@
           <w:color w:val="000000" w:themeColor="text1"/>
         </w:rPr>
       </w:pPr>
-      <w:bookmarkStart w:id="0" w:name="_Toc243237429"/>
+      <w:bookmarkStart w:id="0" w:name="_Toc243321398"/>
       <w:r>
         <w:rPr>
           <w:rFonts w:ascii="Times New Roman" w:hAnsi="Times New Roman" w:cs="Times New Roman"/>
@@ -3479,7 +3565,7 @@
           <w:color w:val="000000" w:themeColor="text1"/>
         </w:rPr>
       </w:pPr>
-      <w:bookmarkStart w:id="1" w:name="_Toc243237430"/>
+      <w:bookmarkStart w:id="1" w:name="_Toc243321399"/>
       <w:r>
         <w:rPr>
           <w:rFonts w:ascii="Times New Roman" w:hAnsi="Times New Roman" w:cs="Times New Roman"/>
@@ -3642,7 +3728,25 @@
           <w:sz w:val="22"/>
           <w:szCs w:val="22"/>
         </w:rPr>
-        <w:t>. Government programmes such as South Africa Connect aim to close the gap, but access is still uneven. Education strongly affects employment and the open question is whether internet access changes how much education pays off. If it does, money spent on education may be under-delivering in places where people cannot get online.</w:t>
+        <w:t>.</w:t>
+      </w:r>
+      <w:r>
+        <w:rPr>
+          <w:rFonts w:ascii="Times New Roman" w:eastAsia="Calibri" w:hAnsi="Times New Roman" w:cs="Times New Roman"/>
+          <w:color w:val="000000" w:themeColor="text1"/>
+          <w:sz w:val="22"/>
+          <w:szCs w:val="22"/>
+        </w:rPr>
+        <w:t xml:space="preserve"> </w:t>
+      </w:r>
+      <w:r>
+        <w:rPr>
+          <w:rFonts w:ascii="Times New Roman" w:eastAsia="Calibri" w:hAnsi="Times New Roman" w:cs="Times New Roman"/>
+          <w:color w:val="000000" w:themeColor="text1"/>
+          <w:sz w:val="22"/>
+          <w:szCs w:val="22"/>
+        </w:rPr>
+        <w:t>Education strongly affects employment and the open question is whether internet access changes how much education pays off. If it does, money spent on education may be under-delivering in places where people cannot get online.</w:t>
       </w:r>
     </w:p>
     <w:p>
@@ -4271,7 +4375,7 @@
           <w:color w:val="000000" w:themeColor="text1"/>
         </w:rPr>
       </w:pPr>
-      <w:bookmarkStart w:id="2" w:name="_Toc243237431"/>
+      <w:bookmarkStart w:id="2" w:name="_Toc243321400"/>
       <w:r>
         <w:rPr>
           <w:rFonts w:ascii="Times New Roman" w:hAnsi="Times New Roman" w:cs="Times New Roman"/>
@@ -6027,7 +6131,7 @@
           <w:color w:val="000000" w:themeColor="text1"/>
         </w:rPr>
       </w:pPr>
-      <w:bookmarkStart w:id="3" w:name="_Toc243237432"/>
+      <w:bookmarkStart w:id="3" w:name="_Toc243321401"/>
       <w:r>
         <w:rPr>
           <w:rFonts w:ascii="Times New Roman" w:hAnsi="Times New Roman" w:cs="Times New Roman"/>
@@ -6782,7 +6886,7 @@
           <w:color w:val="000000" w:themeColor="text1"/>
         </w:rPr>
       </w:pPr>
-      <w:bookmarkStart w:id="4" w:name="_Toc243237433"/>
+      <w:bookmarkStart w:id="4" w:name="_Toc243321402"/>
       <w:r>
         <w:rPr>
           <w:rFonts w:ascii="Times New Roman" w:hAnsi="Times New Roman" w:cs="Times New Roman"/>
@@ -8428,7 +8532,7 @@
           <w:color w:val="000000" w:themeColor="text1"/>
         </w:rPr>
       </w:pPr>
-      <w:bookmarkStart w:id="5" w:name="_Toc243237434"/>
+      <w:bookmarkStart w:id="5" w:name="_Toc243321403"/>
       <w:r>
         <w:rPr>
           <w:rFonts w:ascii="Times New Roman" w:hAnsi="Times New Roman" w:cs="Times New Roman"/>
@@ -8795,7 +8899,7 @@
           <w:color w:val="000000" w:themeColor="text1"/>
         </w:rPr>
       </w:pPr>
-      <w:bookmarkStart w:id="6" w:name="_Toc243237435"/>
+      <w:bookmarkStart w:id="6" w:name="_Toc243321404"/>
       <w:r>
         <w:rPr>
           <w:rStyle w:val="Heading1Char"/>
@@ -9698,7 +9802,7 @@
           <w:color w:val="000000" w:themeColor="text1"/>
         </w:rPr>
       </w:pPr>
-      <w:bookmarkStart w:id="7" w:name="_Toc243237436"/>
+      <w:bookmarkStart w:id="7" w:name="_Toc243321405"/>
       <w:r>
         <w:rPr>
           <w:rFonts w:ascii="Times New Roman" w:hAnsi="Times New Roman" w:cs="Times New Roman"/>
@@ -10522,7 +10626,7 @@
           <w:color w:val="auto"/>
         </w:rPr>
       </w:pPr>
-      <w:bookmarkStart w:id="8" w:name="_Toc243237437"/>
+      <w:bookmarkStart w:id="8" w:name="_Toc243321406"/>
       <w:r>
         <w:rPr>
           <w:rFonts w:ascii="Times New Roman" w:hAnsi="Times New Roman" w:cs="Times New Roman"/>
@@ -10546,7 +10650,7 @@
           <w:color w:val="auto"/>
         </w:rPr>
       </w:pPr>
-      <w:bookmarkStart w:id="9" w:name="_Toc243237438"/>
+      <w:bookmarkStart w:id="9" w:name="_Toc243321407"/>
       <w:r>
         <w:rPr>
           <w:rFonts w:ascii="Times New Roman" w:hAnsi="Times New Roman" w:cs="Times New Roman"/>
@@ -10864,7 +10968,7 @@
         </w:rPr>
       </w:pPr>
       <w:bookmarkStart w:id="10" w:name="_Toc243218144"/>
-      <w:bookmarkStart w:id="11" w:name="_Toc243237439"/>
+      <w:bookmarkStart w:id="11" w:name="_Toc243321408"/>
       <w:r>
         <w:rPr>
           <w:rFonts w:ascii="Times New Roman" w:hAnsi="Times New Roman" w:cs="Times New Roman"/>
@@ -10908,7 +11012,7 @@
         </w:rPr>
       </w:pPr>
       <w:bookmarkStart w:id="12" w:name="_Toc243218145"/>
-      <w:bookmarkStart w:id="13" w:name="_Toc243237440"/>
+      <w:bookmarkStart w:id="13" w:name="_Toc243321409"/>
       <w:r>
         <w:rPr>
           <w:rFonts w:ascii="Times New Roman" w:hAnsi="Times New Roman" w:cs="Times New Roman"/>
@@ -10953,7 +11057,7 @@
           <w:color w:val="000000" w:themeColor="text1"/>
         </w:rPr>
       </w:pPr>
-      <w:bookmarkStart w:id="14" w:name="_Toc243237441"/>
+      <w:bookmarkStart w:id="14" w:name="_Toc243321410"/>
       <w:r>
         <w:rPr>
           <w:rFonts w:ascii="Times New Roman" w:hAnsi="Times New Roman" w:cs="Times New Roman"/>
@@ -11753,7 +11857,7 @@
           <w:color w:val="000000" w:themeColor="text1"/>
         </w:rPr>
       </w:pPr>
-      <w:bookmarkStart w:id="15" w:name="_Toc243237442"/>
+      <w:bookmarkStart w:id="15" w:name="_Toc243321411"/>
       <w:r>
         <w:rPr>
           <w:rFonts w:ascii="Times New Roman" w:hAnsi="Times New Roman" w:cs="Times New Roman"/>
@@ -11777,7 +11881,7 @@
           <w:color w:val="000000" w:themeColor="text1"/>
         </w:rPr>
       </w:pPr>
-      <w:bookmarkStart w:id="16" w:name="_Toc243237443"/>
+      <w:bookmarkStart w:id="16" w:name="_Toc243321412"/>
       <w:r>
         <w:rPr>
           <w:rFonts w:ascii="Times New Roman" w:hAnsi="Times New Roman" w:cs="Times New Roman"/>
@@ -11985,7 +12089,7 @@
           <w:color w:val="000000" w:themeColor="text1"/>
         </w:rPr>
       </w:pPr>
-      <w:bookmarkStart w:id="17" w:name="_Toc243237444"/>
+      <w:bookmarkStart w:id="17" w:name="_Toc243321413"/>
       <w:r>
         <w:rPr>
           <w:rFonts w:ascii="Times New Roman" w:hAnsi="Times New Roman" w:cs="Times New Roman"/>
@@ -12545,7 +12649,7 @@
         </w:rPr>
       </w:pPr>
       <w:bookmarkStart w:id="18" w:name="_Toc243218151"/>
-      <w:bookmarkStart w:id="19" w:name="_Toc243237445"/>
+      <w:bookmarkStart w:id="19" w:name="_Toc243321414"/>
       <w:r>
         <w:rPr>
           <w:rFonts w:ascii="Times New Roman" w:eastAsia="Calibri" w:hAnsi="Times New Roman" w:cs="Times New Roman"/>
@@ -12569,7 +12673,7 @@
           <w:color w:val="000000" w:themeColor="text1"/>
         </w:rPr>
       </w:pPr>
-      <w:bookmarkStart w:id="20" w:name="_Toc243237446"/>
+      <w:bookmarkStart w:id="20" w:name="_Toc243321415"/>
       <w:r>
         <w:rPr>
           <w:rFonts w:ascii="Times New Roman" w:hAnsi="Times New Roman" w:cs="Times New Roman"/>
@@ -13723,7 +13827,7 @@
           <w:color w:val="000000" w:themeColor="text1"/>
         </w:rPr>
       </w:pPr>
-      <w:bookmarkStart w:id="21" w:name="_Toc243237447"/>
+      <w:bookmarkStart w:id="21" w:name="_Toc243321416"/>
       <w:r>
         <w:rPr>
           <w:rFonts w:ascii="Times New Roman" w:hAnsi="Times New Roman" w:cs="Times New Roman"/>
@@ -13746,7 +13850,7 @@
           <w:color w:val="000000" w:themeColor="text1"/>
         </w:rPr>
       </w:pPr>
-      <w:bookmarkStart w:id="22" w:name="_Toc243237448"/>
+      <w:bookmarkStart w:id="22" w:name="_Toc243321417"/>
       <w:r>
         <w:rPr>
           <w:rFonts w:ascii="Times New Roman" w:hAnsi="Times New Roman" w:cs="Times New Roman"/>
@@ -13819,7 +13923,7 @@
           <w:color w:val="000000" w:themeColor="text1"/>
         </w:rPr>
       </w:pPr>
-      <w:bookmarkStart w:id="23" w:name="_Toc243237449"/>
+      <w:bookmarkStart w:id="23" w:name="_Toc243321418"/>
       <w:r>
         <w:rPr>
           <w:rFonts w:ascii="Times New Roman" w:hAnsi="Times New Roman" w:cs="Times New Roman"/>
@@ -13910,7 +14014,7 @@
           <w:color w:val="000000" w:themeColor="text1"/>
         </w:rPr>
       </w:pPr>
-      <w:bookmarkStart w:id="24" w:name="_Toc243237450"/>
+      <w:bookmarkStart w:id="24" w:name="_Toc243321419"/>
       <w:r>
         <w:rPr>
           <w:rFonts w:ascii="Times New Roman" w:hAnsi="Times New Roman" w:cs="Times New Roman"/>
@@ -15074,7 +15178,7 @@
           <w:color w:val="000000" w:themeColor="text1"/>
         </w:rPr>
       </w:pPr>
-      <w:bookmarkStart w:id="25" w:name="_Toc243237451"/>
+      <w:bookmarkStart w:id="25" w:name="_Toc243321420"/>
       <w:r>
         <w:rPr>
           <w:rFonts w:ascii="Times New Roman" w:hAnsi="Times New Roman" w:cs="Times New Roman"/>
@@ -15230,7 +15334,7 @@
           <w:color w:val="000000" w:themeColor="text1"/>
         </w:rPr>
       </w:pPr>
-      <w:bookmarkStart w:id="26" w:name="_Toc243237452"/>
+      <w:bookmarkStart w:id="26" w:name="_Toc243321421"/>
       <w:r>
         <w:rPr>
           <w:rFonts w:ascii="Times New Roman" w:hAnsi="Times New Roman" w:cs="Times New Roman"/>
@@ -15497,7 +15601,7 @@
           <w:color w:val="000000" w:themeColor="text1"/>
         </w:rPr>
       </w:pPr>
-      <w:bookmarkStart w:id="27" w:name="_Toc243237453"/>
+      <w:bookmarkStart w:id="27" w:name="_Toc243321422"/>
       <w:r>
         <w:rPr>
           <w:rFonts w:ascii="Times New Roman" w:hAnsi="Times New Roman" w:cs="Times New Roman"/>
@@ -16454,7 +16558,11 @@
         </w:tc>
       </w:tr>
     </w:tbl>
-    <w:p/>
+    <w:p>
+      <w:r>
+        <w:t xml:space="preserve">Retrain when Statistics South Africa releases a new survey wave or any check shows “Action needed”, by rerunning notebooks 2.1 to 3.4. Retire the model if retraining cannot bring the AUC back above 0.70, if the education or internet questions change, if the interaction stops being significant in later waves, or if it starts being used for decisions about individuals </w:t>
+      </w:r>
+    </w:p>
     <w:p>
       <w:pPr>
         <w:pStyle w:val="Heading2"/>
@@ -16466,16 +16574,36 @@
           <w:color w:val="000000" w:themeColor="text1"/>
         </w:rPr>
       </w:pPr>
+      <w:bookmarkStart w:id="28" w:name="_Toc243321423"/>
       <w:r>
         <w:rPr>
           <w:color w:val="000000" w:themeColor="text1"/>
         </w:rPr>
         <w:t>AI Usage Log</w:t>
       </w:r>
+      <w:bookmarkEnd w:id="28"/>
     </w:p>
     <w:p>
       <w:r>
-        <w:t>For this project, we used Claude, if we struggled to interpret any values we got from models, or needed any help with writing code Claude was used. We also used Claude to help write the documents, since it has a better vocabulary and is better at structuring sentences then us. It also helped us with a colour scheme for the power bi, and helped us pick models. After Claude produced work for us we would read through it make sure everything it was saying was correct and that it worked.</w:t>
+        <w:t>For this project, we used Claude, if we struggled to interpret any values we got from models, or needed any help with writing code Claude was used. We also used Claude to help write the documents, since it has a better vocabulary and is better at structuring sentences th</w:t>
+      </w:r>
+      <w:r>
+        <w:t>a</w:t>
+      </w:r>
+      <w:r>
+        <w:t xml:space="preserve">n us. It also helped us with a colour scheme for the </w:t>
+      </w:r>
+      <w:r>
+        <w:t>P</w:t>
+      </w:r>
+      <w:r>
+        <w:t xml:space="preserve">ower </w:t>
+      </w:r>
+      <w:r>
+        <w:t>BI</w:t>
+      </w:r>
+      <w:r>
+        <w:t>, and helped us pick models. After Claude produced work for us we would read through it make sure everything it was saying was correct and that it worked.</w:t>
       </w:r>
     </w:p>
     <w:sectPr>
@@ -19711,6 +19839,7 @@
   <w:style w:type="character" w:default="1" w:styleId="DefaultParagraphFont">
     <w:name w:val="Default Paragraph Font"/>
     <w:uiPriority w:val="1"/>
+    <w:semiHidden/>
     <w:unhideWhenUsed/>
   </w:style>
   <w:style w:type="table" w:default="1" w:styleId="TableNormal">

</xml_diff>